<commit_message>
anlık fotoğraf ve video
</commit_message>
<xml_diff>
--- a/Staj_Teknik_Analiz_Raporlari/Gun_Gun_Yapilacaklar_17_Is_Gunu.docx
+++ b/Staj_Teknik_Analiz_Raporlari/Gun_Gun_Yapilacaklar_17_Is_Gunu.docx
@@ -25,7 +25,7 @@
         <w:rPr>
           <w:b/>
           <w:color w:val="1D4ED8"/>
-          <w:sz w:val="52"/>
+          <w:sz w:val="50"/>
         </w:rPr>
         <w:t>Gün Gün Yapılacaklar</w:t>
       </w:r>
@@ -69,7 +69,7 @@
       <w:tr>
         <w:tc>
           <w:tcPr>
-            <w:tcW w:type="dxa" w:w="3456"/>
+            <w:tcW w:type="dxa" w:w="3312"/>
           </w:tcPr>
           <w:p>
             <w:r>
@@ -84,7 +84,7 @@
         </w:tc>
         <w:tc>
           <w:tcPr>
-            <w:tcW w:type="dxa" w:w="5760"/>
+            <w:tcW w:type="dxa" w:w="5904"/>
           </w:tcPr>
           <w:p>
             <w:r>
@@ -99,7 +99,7 @@
       <w:tr>
         <w:tc>
           <w:tcPr>
-            <w:tcW w:type="dxa" w:w="3456"/>
+            <w:tcW w:type="dxa" w:w="3312"/>
           </w:tcPr>
           <w:p>
             <w:r>
@@ -114,7 +114,7 @@
         </w:tc>
         <w:tc>
           <w:tcPr>
-            <w:tcW w:type="dxa" w:w="5760"/>
+            <w:tcW w:type="dxa" w:w="5904"/>
           </w:tcPr>
           <w:p>
             <w:r>
@@ -129,7 +129,7 @@
       <w:tr>
         <w:tc>
           <w:tcPr>
-            <w:tcW w:type="dxa" w:w="3456"/>
+            <w:tcW w:type="dxa" w:w="3312"/>
           </w:tcPr>
           <w:p>
             <w:r>
@@ -144,7 +144,7 @@
         </w:tc>
         <w:tc>
           <w:tcPr>
-            <w:tcW w:type="dxa" w:w="5760"/>
+            <w:tcW w:type="dxa" w:w="5904"/>
           </w:tcPr>
           <w:p>
             <w:r>
@@ -159,7 +159,7 @@
       <w:tr>
         <w:tc>
           <w:tcPr>
-            <w:tcW w:type="dxa" w:w="3456"/>
+            <w:tcW w:type="dxa" w:w="3312"/>
           </w:tcPr>
           <w:p>
             <w:r>
@@ -168,20 +168,20 @@
                 <w:color w:val="0B2545"/>
                 <w:sz w:val="22"/>
               </w:rPr>
-              <w:t>Not:</w:t>
+              <w:t>Ek:</w:t>
             </w:r>
           </w:p>
         </w:tc>
         <w:tc>
           <w:tcPr>
-            <w:tcW w:type="dxa" w:w="5760"/>
+            <w:tcW w:type="dxa" w:w="5904"/>
           </w:tcPr>
           <w:p>
             <w:r>
               <w:rPr>
                 <w:sz w:val="22"/>
               </w:rPr>
-              <w:t>Sprint detay raporları ayrı dosyalarda mevcuttur</w:t>
+              <w:t>Sonda tüm dosyaların hangi güne düştüğünü gösteren eşleştirme tablosu var</w:t>
             </w:r>
           </w:p>
         </w:tc>
@@ -195,13 +195,13 @@
     <w:p>
       <w:pPr>
         <w:shd w:val="clear" w:fill="0B2545"/>
-        <w:spacing w:before="80" w:after="80"/>
+        <w:spacing w:before="120" w:after="80"/>
       </w:pPr>
       <w:r>
         <w:rPr>
           <w:b/>
           <w:color w:val="FFFFFF"/>
-          <w:sz w:val="32"/>
+          <w:sz w:val="30"/>
         </w:rPr>
         <w:t>Nasıl Kullanılır?</w:t>
       </w:r>
@@ -216,7 +216,7 @@
           <w:i w:val="0"/>
           <w:sz w:val="21"/>
         </w:rPr>
-        <w:t>Bu belge, 17 iş gününün her biri için somut görevleri ve o günün sonunda elde etmen gereken çıktıyı listeler. Görevleri yukarıdan aşağıya sırayla yap. Bir günü, 'gün sonu çıktısı' gerçekleşmeden kapatma; gerçekleşmiyorsa eksik kalan işi ertesi güne taşı. Aşağıdaki özet tablo, günlerin milestone ve sprintlere dağılımını gösterir.</w:t>
+        <w:t>Bu belge, 17 iş gününün her biri için somut görevleri ve o günün sonunda elde etmen gereken çıktıyı listeler. Görevleri yukarıdan aşağıya sırayla yap. Bir günü, 'gün sonu çıktısı' gerçekleşmeden kapatma. Belgenin sonundaki Ek'te, projedeki HER dosyanın (frontend + backend + altyapı) hangi güne denk geldiğini gösteren eşleştirme tablosu bulunur.</w:t>
       </w:r>
     </w:p>
     <w:tbl>
@@ -631,7 +631,7 @@
               <w:rPr>
                 <w:sz w:val="18"/>
               </w:rPr>
-              <w:t>Ramak Kala &amp; 5×5 Risk Matrisi</w:t>
+              <w:t>Ramak Kala &amp; Risk Değerlendirme</w:t>
             </w:r>
           </w:p>
         </w:tc>
@@ -851,7 +851,7 @@
     <w:p>
       <w:pPr>
         <w:shd w:val="clear" w:fill="0F766E"/>
-        <w:spacing w:before="80" w:after="80"/>
+        <w:spacing w:before="120" w:after="80"/>
       </w:pPr>
       <w:r>
         <w:rPr>
@@ -865,13 +865,12 @@
     <w:p>
       <w:pPr>
         <w:pStyle w:val="Heading1"/>
-        <w:spacing w:before="200"/>
       </w:pPr>
       <w:r>
         <w:rPr>
           <w:b/>
           <w:color w:val="0F766E"/>
-          <w:sz w:val="30"/>
+          <w:sz w:val="28"/>
         </w:rPr>
         <w:t>Sprint 1 — Temel Altyapı &amp; Şema İskeleti  (Gün 1–2)</w:t>
       </w:r>
@@ -982,7 +981,6 @@
       </w:r>
       <w:r>
         <w:rPr>
-          <w:b w:val="0"/>
           <w:sz w:val="20"/>
         </w:rPr>
         <w:t>docker compose up ile 3 servis ayakta; backend :3000/api'de boş olarak çalışıyor.</w:t>
@@ -1080,7 +1078,6 @@
       </w:r>
       <w:r>
         <w:rPr>
-          <w:b w:val="0"/>
           <w:sz w:val="20"/>
         </w:rPr>
         <w:t>İki proje de hatasız derleniyor; client :5173, backend :3000/api; DB'ye bağlanıyor.</w:t>
@@ -1089,13 +1086,12 @@
     <w:p>
       <w:pPr>
         <w:pStyle w:val="Heading1"/>
-        <w:spacing w:before="200"/>
       </w:pPr>
       <w:r>
         <w:rPr>
           <w:b/>
           <w:color w:val="0F766E"/>
-          <w:sz w:val="30"/>
+          <w:sz w:val="28"/>
         </w:rPr>
         <w:t>Sprint 2 — Kimlik Doğrulama &amp; RBAC Çekirdeği  (Gün 3–4)</w:t>
       </w:r>
@@ -1206,7 +1202,6 @@
       </w:r>
       <w:r>
         <w:rPr>
-          <w:b w:val="0"/>
           <w:sz w:val="20"/>
         </w:rPr>
         <w:t>Süper admin ile giriş yapılıp geçerli JWT alınıyor; seed çalışıyor.</w:t>
@@ -1304,7 +1299,6 @@
       </w:r>
       <w:r>
         <w:rPr>
-          <w:b w:val="0"/>
           <w:sz w:val="20"/>
         </w:rPr>
         <w:t>Yetkisiz uç 403 döner; kayıt→PENDING→giriş akışı arayüzden çalışır.</w:t>
@@ -1318,7 +1312,7 @@
     <w:p>
       <w:pPr>
         <w:shd w:val="clear" w:fill="7C3AED"/>
-        <w:spacing w:before="80" w:after="80"/>
+        <w:spacing w:before="120" w:after="80"/>
       </w:pPr>
       <w:r>
         <w:rPr>
@@ -1332,13 +1326,12 @@
     <w:p>
       <w:pPr>
         <w:pStyle w:val="Heading1"/>
-        <w:spacing w:before="200"/>
       </w:pPr>
       <w:r>
         <w:rPr>
           <w:b/>
           <w:color w:val="7C3AED"/>
-          <w:sz w:val="30"/>
+          <w:sz w:val="28"/>
         </w:rPr>
         <w:t>Sprint 3 — Kullanıcı / Rol / Birim Yönetimi  (Gün 5–7)</w:t>
       </w:r>
@@ -1393,7 +1386,7 @@
         <w:rPr>
           <w:sz w:val="21"/>
         </w:rPr>
-        <w:t>departments.controller: birim CRUD + 3 karakter kod kuralı + audit.</w:t>
+        <w:t>departments.controller: birim CRUD + 3 karakter kod kuralı.</w:t>
       </w:r>
     </w:p>
     <w:p>
@@ -1436,7 +1429,6 @@
       </w:r>
       <w:r>
         <w:rPr>
-          <w:b w:val="0"/>
           <w:sz w:val="20"/>
         </w:rPr>
         <w:t>Roller ve birimler API'den yönetilebiliyor; sistem rolleri silinemiyor.</w:t>
@@ -1504,7 +1496,7 @@
         <w:rPr>
           <w:sz w:val="21"/>
         </w:rPr>
-        <w:t>Onay/ret sonrası NotificationsService ile ilgili kullanıcıya bilgi (altyapı hazırlığı).</w:t>
+        <w:t>Onay/ret sonrası ilgili kullanıcıya bilgi bildirimi (altyapı hazırlığı).</w:t>
       </w:r>
     </w:p>
     <w:p>
@@ -1521,7 +1513,6 @@
       </w:r>
       <w:r>
         <w:rPr>
-          <w:b w:val="0"/>
           <w:sz w:val="20"/>
         </w:rPr>
         <w:t>Yönetici bir kullanıcıyı onaylayıp rol/rütbe/birim atayabiliyor (transaction güvenli).</w:t>
@@ -1606,7 +1597,6 @@
       </w:r>
       <w:r>
         <w:rPr>
-          <w:b w:val="0"/>
           <w:sz w:val="20"/>
         </w:rPr>
         <w:t>Menü izinlere göre değişiyor; tüm yönetim akışları arayüzden çalışıyor.</w:t>
@@ -1620,7 +1610,7 @@
     <w:p>
       <w:pPr>
         <w:shd w:val="clear" w:fill="1D4ED8"/>
-        <w:spacing w:before="80" w:after="80"/>
+        <w:spacing w:before="120" w:after="80"/>
       </w:pPr>
       <w:r>
         <w:rPr>
@@ -1634,13 +1624,12 @@
     <w:p>
       <w:pPr>
         <w:pStyle w:val="Heading1"/>
-        <w:spacing w:before="200"/>
       </w:pPr>
       <w:r>
         <w:rPr>
           <w:b/>
           <w:color w:val="1D4ED8"/>
-          <w:sz w:val="30"/>
+          <w:sz w:val="28"/>
         </w:rPr>
         <w:t>Sprint 4 — İş Kazası Bildirimi &amp; Vücut Haritası  (Gün 8–9)</w:t>
       </w:r>
@@ -1682,7 +1671,7 @@
         <w:rPr>
           <w:sz w:val="21"/>
         </w:rPr>
-        <w:t>schema.prisma: Report (tek tablo, tip ayrımı) + BodyInjury + kaza enum'ları (AccidentType, OutcomeSeverity, BodyPart, InjuryType, BodySide, BodyView); migrate.</w:t>
+        <w:t>schema.prisma: Report (tek tablo, tip ayrımı) + BodyInjury + kaza enum'ları; migrate.</w:t>
       </w:r>
     </w:p>
     <w:p>
@@ -1721,7 +1710,7 @@
         <w:rPr>
           <w:sz w:val="21"/>
         </w:rPr>
-        <w:t>reports.controller + report.dto (accident + BodyInjury alt DTO'ları) + audit.</w:t>
+        <w:t>reports.controller + report.dto (accident + BodyInjury alt DTO'ları).</w:t>
       </w:r>
     </w:p>
     <w:p>
@@ -1738,7 +1727,6 @@
       </w:r>
       <w:r>
         <w:rPr>
-          <w:b w:val="0"/>
           <w:sz w:val="20"/>
         </w:rPr>
         <w:t>İş kazası bildirimi API'den oluşturuluyor; her kayda referans no atanıyor.</w:t>
@@ -1810,7 +1798,6 @@
       </w:r>
       <w:r>
         <w:rPr>
-          <w:b w:val="0"/>
           <w:sz w:val="20"/>
         </w:rPr>
         <w:t>Kullanıcı vücut haritasında çoklu yaralanma seçip iş kazası bildirebiliyor.</w:t>
@@ -1819,15 +1806,14 @@
     <w:p>
       <w:pPr>
         <w:pStyle w:val="Heading1"/>
-        <w:spacing w:before="200"/>
       </w:pPr>
       <w:r>
         <w:rPr>
           <w:b/>
           <w:color w:val="1D4ED8"/>
-          <w:sz w:val="30"/>
+          <w:sz w:val="28"/>
         </w:rPr>
-        <w:t>Sprint 5 — Ramak Kala &amp; 5×5 Risk Matrisi  (Gün 10–11)</w:t>
+        <w:t>Sprint 5 — Ramak Kala &amp; Risk Değerlendirme  (Gün 10–11)</w:t>
       </w:r>
     </w:p>
     <w:p>
@@ -1841,7 +1827,7 @@
           <w:color w:val="555F6D"/>
           <w:sz w:val="20"/>
         </w:rPr>
-        <w:t>Ramak kala bildirimi ve 5×5 risk matrisi; risk mantığı istemcide önizleme, backend'de otorite olarak.</w:t>
+        <w:t>Ramak kala bildirimi ve 5×5 risk mantığı; risk istemcide önizleme, backend'de otorite olarak.</w:t>
       </w:r>
     </w:p>
     <w:p>
@@ -1923,7 +1909,6 @@
       </w:r>
       <w:r>
         <w:rPr>
-          <w:b w:val="0"/>
           <w:sz w:val="20"/>
         </w:rPr>
         <w:t>Ramak kala bildirimi API'den oluşturuluyor; risk seviyesi sunucuda hesaplanıyor.</w:t>
@@ -1939,7 +1924,7 @@
           <w:color w:val="0B2545"/>
           <w:sz w:val="25"/>
         </w:rPr>
-        <w:t>Gün 11 — Ramak Kala Formu &amp; 5×5 Matris (Frontend)</w:t>
+        <w:t>Gün 11 — Ramak Kala Formu &amp; Risk Değerlendirme (Frontend)</w:t>
       </w:r>
     </w:p>
     <w:p>
@@ -1952,7 +1937,7 @@
         <w:rPr>
           <w:sz w:val="21"/>
         </w:rPr>
-        <w:t>RiskMatrix.tsx: 5×5 ızgara, şiddet×olasılık seçimi, canlı seviye/renk önizlemesi.</w:t>
+        <w:t>riskLevel yardımcısı (RiskMatrix.tsx): skor→seviye, backend ile aynı eşikler.</w:t>
       </w:r>
     </w:p>
     <w:p>
@@ -1965,7 +1950,7 @@
         <w:rPr>
           <w:sz w:val="21"/>
         </w:rPr>
-        <w:t>NearMissFormPage.tsx: kategori, tehlike sınıfı, risk skorları, kök neden, anlık önlem alanları.</w:t>
+        <w:t>NearMissFormPage.tsx: kategori, tehlike sınıfı, şiddet/olasılık dropdown'ları (açıklamalı), canlı risk rozeti.</w:t>
       </w:r>
     </w:p>
     <w:p>
@@ -1995,10 +1980,9 @@
       </w:r>
       <w:r>
         <w:rPr>
-          <w:b w:val="0"/>
           <w:sz w:val="20"/>
         </w:rPr>
-        <w:t>Kullanıcı ramak kala bildiriyor; risk matrisi renklerle canlı geri bildirim veriyor.</w:t>
+        <w:t>Kullanıcı ramak kala bildiriyor; risk seviyesi canlı gösteriliyor ve backend ile tutarlı.</w:t>
       </w:r>
     </w:p>
     <w:p>
@@ -2009,7 +1993,7 @@
     <w:p>
       <w:pPr>
         <w:shd w:val="clear" w:fill="B45309"/>
-        <w:spacing w:before="80" w:after="80"/>
+        <w:spacing w:before="120" w:after="80"/>
       </w:pPr>
       <w:r>
         <w:rPr>
@@ -2023,13 +2007,12 @@
     <w:p>
       <w:pPr>
         <w:pStyle w:val="Heading1"/>
-        <w:spacing w:before="200"/>
       </w:pPr>
       <w:r>
         <w:rPr>
           <w:b/>
           <w:color w:val="B45309"/>
-          <w:sz w:val="30"/>
+          <w:sz w:val="28"/>
         </w:rPr>
         <w:t>Sprint 6 — İş Akışı, CAPA &amp; Bildirimler  (Gün 12–13)</w:t>
       </w:r>
@@ -2097,7 +2080,7 @@
         <w:rPr>
           <w:sz w:val="21"/>
         </w:rPr>
-        <w:t>reports.service: updateStatus (transaction + kapatma kuralı: ≥10 karakter + tüm CAPA VERIFIED), assign (otomatik INVESTIGATING), addAction, updateActionStatus, stats.</w:t>
+        <w:t>reports.service: updateStatus (transaction + kapatma kuralı: ≥10 karakter + tüm CAPA VERIFIED), assign, addAction, updateActionStatus, stats.</w:t>
       </w:r>
     </w:p>
     <w:p>
@@ -2110,7 +2093,7 @@
         <w:rPr>
           <w:sz w:val="21"/>
         </w:rPr>
-        <w:t>schema.prisma: CorrectiveAction + Notification + ReportStatus/ActionStatus/NotificationType; migrate.</w:t>
+        <w:t>schema.prisma: CorrectiveAction + Notification + ActionStatus/NotificationType; migrate.</w:t>
       </w:r>
     </w:p>
     <w:p>
@@ -2127,7 +2110,6 @@
       </w:r>
       <w:r>
         <w:rPr>
-          <w:b w:val="0"/>
           <w:sz w:val="20"/>
         </w:rPr>
         <w:t>Bildirim durum döngüsü ve CAPA kuralları backend'de eksiksiz çalışıyor.</w:t>
@@ -2212,7 +2194,6 @@
       </w:r>
       <w:r>
         <w:rPr>
-          <w:b w:val="0"/>
           <w:sz w:val="20"/>
         </w:rPr>
         <w:t>Uçtan uca iş akışı: liste → detay → ata → CAPA → kapat; zil sesle uyarıyor.</w:t>
@@ -2221,13 +2202,12 @@
     <w:p>
       <w:pPr>
         <w:pStyle w:val="Heading1"/>
-        <w:spacing w:before="200"/>
       </w:pPr>
       <w:r>
         <w:rPr>
           <w:b/>
           <w:color w:val="B45309"/>
-          <w:sz w:val="30"/>
+          <w:sz w:val="28"/>
         </w:rPr>
         <w:t>Sprint 7 — Nesne Depolama &amp; Güvenli Dosya Erişimi  (Gün 14–15)</w:t>
       </w:r>
@@ -2269,7 +2249,7 @@
         <w:rPr>
           <w:sz w:val="21"/>
         </w:rPr>
-        <w:t>storage.service.ts: MinIO client, bucket garantisi (onModuleInit), put (anahtar üretimi), stat/stream/partialStream, presignedUrl.</w:t>
+        <w:t>storage.service.ts: MinIO client, bucket garantisi (onModuleInit), put, stat/stream/partialStream, presignedUrl.</w:t>
       </w:r>
     </w:p>
     <w:p>
@@ -2325,7 +2305,6 @@
       </w:r>
       <w:r>
         <w:rPr>
-          <w:b w:val="0"/>
           <w:sz w:val="20"/>
         </w:rPr>
         <w:t>Foto/video MinIO private bucket'a yükleniyor; anahtar geri dönüyor.</w:t>
@@ -2354,7 +2333,7 @@
         <w:rPr>
           <w:sz w:val="21"/>
         </w:rPr>
-        <w:t>files.controller: anahtar biçim doğrulama, ekin bir bildirime ait olduğunu eşleme, report-access ile yetki kontrolü, video Range (206), imzalı URL (≤5 dk, loglanmaz).</w:t>
+        <w:t>files.controller: anahtar biçim doğrulama, ek-bildirim eşleme, report-access ile yetki kontrolü, video Range (206), imzalı URL (≤5 dk).</w:t>
       </w:r>
     </w:p>
     <w:p>
@@ -2397,7 +2376,6 @@
       </w:r>
       <w:r>
         <w:rPr>
-          <w:b w:val="0"/>
           <w:sz w:val="20"/>
         </w:rPr>
         <w:t>Ekler yalnızca yetkili kullanıcıya sunuluyor; video ileri/geri sarılabiliyor.</w:t>
@@ -2411,7 +2389,7 @@
     <w:p>
       <w:pPr>
         <w:shd w:val="clear" w:fill="BE123C"/>
-        <w:spacing w:before="80" w:after="80"/>
+        <w:spacing w:before="120" w:after="80"/>
       </w:pPr>
       <w:r>
         <w:rPr>
@@ -2425,13 +2403,12 @@
     <w:p>
       <w:pPr>
         <w:pStyle w:val="Heading1"/>
-        <w:spacing w:before="200"/>
       </w:pPr>
       <w:r>
         <w:rPr>
           <w:b/>
           <w:color w:val="BE123B"/>
-          <w:sz w:val="30"/>
+          <w:sz w:val="28"/>
         </w:rPr>
         <w:t>Sprint 8 — Denetim, Pano &amp; Cilalama  (Gün 16–17)</w:t>
       </w:r>
@@ -2542,7 +2519,6 @@
       </w:r>
       <w:r>
         <w:rPr>
-          <w:b w:val="0"/>
           <w:sz w:val="20"/>
         </w:rPr>
         <w:t>Her kritik işlem sessizce loglanıyor; yetkili kullanıcı denetim izini görebiliyor.</w:t>
@@ -2640,7 +2616,6 @@
       </w:r>
       <w:r>
         <w:rPr>
-          <w:b w:val="0"/>
           <w:sz w:val="20"/>
         </w:rPr>
         <w:t>Ürün demo-hazır: pano, PDF, çoklu dil, profil ve denetim tamamlanmış durumda.</w:t>
@@ -2654,13 +2629,13 @@
     <w:p>
       <w:pPr>
         <w:shd w:val="clear" w:fill="0B2545"/>
-        <w:spacing w:before="80" w:after="80"/>
+        <w:spacing w:before="120" w:after="80"/>
       </w:pPr>
       <w:r>
         <w:rPr>
           <w:b/>
           <w:color w:val="FFFFFF"/>
-          <w:sz w:val="32"/>
+          <w:sz w:val="30"/>
         </w:rPr>
         <w:t>Bitiş — Tamamlanma Kontrol Listesi</w:t>
       </w:r>
@@ -2714,7 +2689,7 @@
         <w:rPr>
           <w:sz w:val="21"/>
         </w:rPr>
-        <w:t>İş kazası (vücut haritası) ve ramak kala (5×5 risk) bildirimleri oluşturulabiliyor.</w:t>
+        <w:t>İş kazası (vücut haritası) ve ramak kala (risk) bildirimleri oluşturulabiliyor.</w:t>
       </w:r>
     </w:p>
     <w:p>
@@ -2767,6 +2742,2792 @@
           <w:sz w:val="21"/>
         </w:rPr>
         <w:t>Uçtan uca duman testi (smoke test) ve demo provası yapıldı.</w:t>
+      </w:r>
+    </w:p>
+    <w:p>
+      <w:r>
+        <w:br w:type="page"/>
+      </w:r>
+    </w:p>
+    <w:p>
+      <w:pPr>
+        <w:shd w:val="clear" w:fill="0B2545"/>
+        <w:spacing w:before="120" w:after="80"/>
+      </w:pPr>
+      <w:r>
+        <w:rPr>
+          <w:b/>
+          <w:color w:val="FFFFFF"/>
+          <w:sz w:val="30"/>
+        </w:rPr>
+        <w:t>EK — Dosya → Gün Eşleştirme Tablosu</w:t>
+      </w:r>
+    </w:p>
+    <w:p>
+      <w:pPr>
+        <w:spacing w:after="120"/>
+      </w:pPr>
+      <w:r>
+        <w:rPr>
+          <w:b w:val="0"/>
+          <w:i/>
+          <w:color w:val="555F6D"/>
+          <w:sz w:val="21"/>
+        </w:rPr>
+        <w:t>Projedeki tüm dosyaların hangi güne (ve sprinte) denk geldiği. Bazı 'omurga' dosyalar birden çok günde büyür (artımlı geliştirme); bunlar birden fazla gün numarasıyla gösterilmiştir.</w:t>
+      </w:r>
+    </w:p>
+    <w:p>
+      <w:pPr>
+        <w:pStyle w:val="Heading2"/>
+      </w:pPr>
+      <w:r>
+        <w:rPr>
+          <w:b/>
+          <w:color w:val="0F766E"/>
+          <w:sz w:val="25"/>
+        </w:rPr>
+        <w:t>A) Altyapı &amp; Yapılandırma</w:t>
+      </w:r>
+    </w:p>
+    <w:tbl>
+      <w:tblPr>
+        <w:tblStyle w:val="TableGrid"/>
+        <w:tblW w:type="auto" w:w="0"/>
+        <w:jc w:val="center"/>
+        <w:tblLook w:firstColumn="1" w:firstRow="1" w:lastColumn="0" w:lastRow="0" w:noHBand="0" w:noVBand="1" w:val="04A0"/>
+      </w:tblPr>
+      <w:tblGrid>
+        <w:gridCol w:w="3264"/>
+        <w:gridCol w:w="3264"/>
+        <w:gridCol w:w="3264"/>
+      </w:tblGrid>
+      <w:tr>
+        <w:tc>
+          <w:tcPr>
+            <w:tcW w:type="dxa" w:w="6336"/>
+            <w:shd w:val="clear" w:fill="0F766E"/>
+          </w:tcPr>
+          <w:p>
+            <w:r>
+              <w:rPr>
+                <w:b/>
+                <w:color w:val="FFFFFF"/>
+                <w:sz w:val="18"/>
+              </w:rPr>
+              <w:t>Dosya</w:t>
+            </w:r>
+          </w:p>
+        </w:tc>
+        <w:tc>
+          <w:tcPr>
+            <w:tcW w:type="dxa" w:w="1152"/>
+            <w:shd w:val="clear" w:fill="0F766E"/>
+          </w:tcPr>
+          <w:p>
+            <w:r>
+              <w:rPr>
+                <w:b/>
+                <w:color w:val="FFFFFF"/>
+                <w:sz w:val="18"/>
+              </w:rPr>
+              <w:t>Gün</w:t>
+            </w:r>
+          </w:p>
+        </w:tc>
+        <w:tc>
+          <w:tcPr>
+            <w:tcW w:type="dxa" w:w="1296"/>
+            <w:shd w:val="clear" w:fill="0F766E"/>
+          </w:tcPr>
+          <w:p>
+            <w:r>
+              <w:rPr>
+                <w:b/>
+                <w:color w:val="FFFFFF"/>
+                <w:sz w:val="18"/>
+              </w:rPr>
+              <w:t>Sprint</w:t>
+            </w:r>
+          </w:p>
+        </w:tc>
+      </w:tr>
+      <w:tr>
+        <w:tc>
+          <w:tcPr>
+            <w:tcW w:type="dxa" w:w="6336"/>
+          </w:tcPr>
+          <w:p>
+            <w:pPr>
+              <w:spacing w:after="20"/>
+            </w:pPr>
+            <w:r>
+              <w:rPr>
+                <w:sz w:val="18"/>
+              </w:rPr>
+              <w:t>docker-compose.yml</w:t>
+            </w:r>
+          </w:p>
+        </w:tc>
+        <w:tc>
+          <w:tcPr>
+            <w:tcW w:type="dxa" w:w="1152"/>
+          </w:tcPr>
+          <w:p>
+            <w:pPr>
+              <w:spacing w:after="20"/>
+            </w:pPr>
+            <w:r>
+              <w:rPr>
+                <w:sz w:val="18"/>
+              </w:rPr>
+              <w:t>1</w:t>
+            </w:r>
+          </w:p>
+        </w:tc>
+        <w:tc>
+          <w:tcPr>
+            <w:tcW w:type="dxa" w:w="1296"/>
+          </w:tcPr>
+          <w:p>
+            <w:pPr>
+              <w:spacing w:after="20"/>
+            </w:pPr>
+            <w:r>
+              <w:rPr>
+                <w:sz w:val="18"/>
+              </w:rPr>
+              <w:t>S1</w:t>
+            </w:r>
+          </w:p>
+        </w:tc>
+      </w:tr>
+      <w:tr>
+        <w:tc>
+          <w:tcPr>
+            <w:tcW w:type="dxa" w:w="6336"/>
+            <w:shd w:val="clear" w:fill="F3F4F6"/>
+          </w:tcPr>
+          <w:p>
+            <w:pPr>
+              <w:spacing w:after="20"/>
+            </w:pPr>
+            <w:r>
+              <w:rPr>
+                <w:sz w:val="18"/>
+              </w:rPr>
+              <w:t>pgadmin/servers.json</w:t>
+            </w:r>
+          </w:p>
+        </w:tc>
+        <w:tc>
+          <w:tcPr>
+            <w:tcW w:type="dxa" w:w="1152"/>
+            <w:shd w:val="clear" w:fill="F3F4F6"/>
+          </w:tcPr>
+          <w:p>
+            <w:pPr>
+              <w:spacing w:after="20"/>
+            </w:pPr>
+            <w:r>
+              <w:rPr>
+                <w:sz w:val="18"/>
+              </w:rPr>
+              <w:t>1</w:t>
+            </w:r>
+          </w:p>
+        </w:tc>
+        <w:tc>
+          <w:tcPr>
+            <w:tcW w:type="dxa" w:w="1296"/>
+            <w:shd w:val="clear" w:fill="F3F4F6"/>
+          </w:tcPr>
+          <w:p>
+            <w:pPr>
+              <w:spacing w:after="20"/>
+            </w:pPr>
+            <w:r>
+              <w:rPr>
+                <w:sz w:val="18"/>
+              </w:rPr>
+              <w:t>S1</w:t>
+            </w:r>
+          </w:p>
+        </w:tc>
+      </w:tr>
+      <w:tr>
+        <w:tc>
+          <w:tcPr>
+            <w:tcW w:type="dxa" w:w="6336"/>
+          </w:tcPr>
+          <w:p>
+            <w:pPr>
+              <w:spacing w:after="20"/>
+            </w:pPr>
+            <w:r>
+              <w:rPr>
+                <w:sz w:val="18"/>
+              </w:rPr>
+              <w:t>backend/package.json, nest-cli.json, tsconfig.json</w:t>
+            </w:r>
+          </w:p>
+        </w:tc>
+        <w:tc>
+          <w:tcPr>
+            <w:tcW w:type="dxa" w:w="1152"/>
+          </w:tcPr>
+          <w:p>
+            <w:pPr>
+              <w:spacing w:after="20"/>
+            </w:pPr>
+            <w:r>
+              <w:rPr>
+                <w:sz w:val="18"/>
+              </w:rPr>
+              <w:t>1</w:t>
+            </w:r>
+          </w:p>
+        </w:tc>
+        <w:tc>
+          <w:tcPr>
+            <w:tcW w:type="dxa" w:w="1296"/>
+          </w:tcPr>
+          <w:p>
+            <w:pPr>
+              <w:spacing w:after="20"/>
+            </w:pPr>
+            <w:r>
+              <w:rPr>
+                <w:sz w:val="18"/>
+              </w:rPr>
+              <w:t>S1</w:t>
+            </w:r>
+          </w:p>
+        </w:tc>
+      </w:tr>
+      <w:tr>
+        <w:tc>
+          <w:tcPr>
+            <w:tcW w:type="dxa" w:w="6336"/>
+            <w:shd w:val="clear" w:fill="F3F4F6"/>
+          </w:tcPr>
+          <w:p>
+            <w:pPr>
+              <w:spacing w:after="20"/>
+            </w:pPr>
+            <w:r>
+              <w:rPr>
+                <w:sz w:val="18"/>
+              </w:rPr>
+              <w:t>backend/.env, .env.example</w:t>
+            </w:r>
+          </w:p>
+        </w:tc>
+        <w:tc>
+          <w:tcPr>
+            <w:tcW w:type="dxa" w:w="1152"/>
+            <w:shd w:val="clear" w:fill="F3F4F6"/>
+          </w:tcPr>
+          <w:p>
+            <w:pPr>
+              <w:spacing w:after="20"/>
+            </w:pPr>
+            <w:r>
+              <w:rPr>
+                <w:sz w:val="18"/>
+              </w:rPr>
+              <w:t>1</w:t>
+            </w:r>
+          </w:p>
+        </w:tc>
+        <w:tc>
+          <w:tcPr>
+            <w:tcW w:type="dxa" w:w="1296"/>
+            <w:shd w:val="clear" w:fill="F3F4F6"/>
+          </w:tcPr>
+          <w:p>
+            <w:pPr>
+              <w:spacing w:after="20"/>
+            </w:pPr>
+            <w:r>
+              <w:rPr>
+                <w:sz w:val="18"/>
+              </w:rPr>
+              <w:t>S1</w:t>
+            </w:r>
+          </w:p>
+        </w:tc>
+      </w:tr>
+      <w:tr>
+        <w:tc>
+          <w:tcPr>
+            <w:tcW w:type="dxa" w:w="6336"/>
+          </w:tcPr>
+          <w:p>
+            <w:pPr>
+              <w:spacing w:after="20"/>
+            </w:pPr>
+            <w:r>
+              <w:rPr>
+                <w:sz w:val="18"/>
+              </w:rPr>
+              <w:t>client/package.json, vite.config.ts</w:t>
+            </w:r>
+          </w:p>
+        </w:tc>
+        <w:tc>
+          <w:tcPr>
+            <w:tcW w:type="dxa" w:w="1152"/>
+          </w:tcPr>
+          <w:p>
+            <w:pPr>
+              <w:spacing w:after="20"/>
+            </w:pPr>
+            <w:r>
+              <w:rPr>
+                <w:sz w:val="18"/>
+              </w:rPr>
+              <w:t>2</w:t>
+            </w:r>
+          </w:p>
+        </w:tc>
+        <w:tc>
+          <w:tcPr>
+            <w:tcW w:type="dxa" w:w="1296"/>
+          </w:tcPr>
+          <w:p>
+            <w:pPr>
+              <w:spacing w:after="20"/>
+            </w:pPr>
+            <w:r>
+              <w:rPr>
+                <w:sz w:val="18"/>
+              </w:rPr>
+              <w:t>S1</w:t>
+            </w:r>
+          </w:p>
+        </w:tc>
+      </w:tr>
+    </w:tbl>
+    <w:p>
+      <w:pPr>
+        <w:pStyle w:val="Heading2"/>
+      </w:pPr>
+      <w:r>
+        <w:rPr>
+          <w:b/>
+          <w:color w:val="7C3AED"/>
+          <w:sz w:val="25"/>
+        </w:rPr>
+        <w:t>B) Prisma (Veri Katmanı)</w:t>
+      </w:r>
+    </w:p>
+    <w:tbl>
+      <w:tblPr>
+        <w:tblStyle w:val="TableGrid"/>
+        <w:tblW w:type="auto" w:w="0"/>
+        <w:jc w:val="center"/>
+        <w:tblLook w:firstColumn="1" w:firstRow="1" w:lastColumn="0" w:lastRow="0" w:noHBand="0" w:noVBand="1" w:val="04A0"/>
+      </w:tblPr>
+      <w:tblGrid>
+        <w:gridCol w:w="3264"/>
+        <w:gridCol w:w="3264"/>
+        <w:gridCol w:w="3264"/>
+      </w:tblGrid>
+      <w:tr>
+        <w:tc>
+          <w:tcPr>
+            <w:tcW w:type="dxa" w:w="6336"/>
+            <w:shd w:val="clear" w:fill="7C3AED"/>
+          </w:tcPr>
+          <w:p>
+            <w:r>
+              <w:rPr>
+                <w:b/>
+                <w:color w:val="FFFFFF"/>
+                <w:sz w:val="18"/>
+              </w:rPr>
+              <w:t>Dosya</w:t>
+            </w:r>
+          </w:p>
+        </w:tc>
+        <w:tc>
+          <w:tcPr>
+            <w:tcW w:type="dxa" w:w="1152"/>
+            <w:shd w:val="clear" w:fill="7C3AED"/>
+          </w:tcPr>
+          <w:p>
+            <w:r>
+              <w:rPr>
+                <w:b/>
+                <w:color w:val="FFFFFF"/>
+                <w:sz w:val="18"/>
+              </w:rPr>
+              <w:t>Gün</w:t>
+            </w:r>
+          </w:p>
+        </w:tc>
+        <w:tc>
+          <w:tcPr>
+            <w:tcW w:type="dxa" w:w="1296"/>
+            <w:shd w:val="clear" w:fill="7C3AED"/>
+          </w:tcPr>
+          <w:p>
+            <w:r>
+              <w:rPr>
+                <w:b/>
+                <w:color w:val="FFFFFF"/>
+                <w:sz w:val="18"/>
+              </w:rPr>
+              <w:t>Sprint</w:t>
+            </w:r>
+          </w:p>
+        </w:tc>
+      </w:tr>
+      <w:tr>
+        <w:tc>
+          <w:tcPr>
+            <w:tcW w:type="dxa" w:w="6336"/>
+          </w:tcPr>
+          <w:p>
+            <w:pPr>
+              <w:spacing w:after="20"/>
+            </w:pPr>
+            <w:r>
+              <w:rPr>
+                <w:sz w:val="18"/>
+              </w:rPr>
+              <w:t>prisma/schema.prisma</w:t>
+            </w:r>
+          </w:p>
+        </w:tc>
+        <w:tc>
+          <w:tcPr>
+            <w:tcW w:type="dxa" w:w="1152"/>
+          </w:tcPr>
+          <w:p>
+            <w:pPr>
+              <w:spacing w:after="20"/>
+            </w:pPr>
+            <w:r>
+              <w:rPr>
+                <w:sz w:val="18"/>
+              </w:rPr>
+              <w:t>1-2 temel → 3,5,8,10,12,16 (büyür)</w:t>
+            </w:r>
+          </w:p>
+        </w:tc>
+        <w:tc>
+          <w:tcPr>
+            <w:tcW w:type="dxa" w:w="1296"/>
+          </w:tcPr>
+          <w:p>
+            <w:pPr>
+              <w:spacing w:after="20"/>
+            </w:pPr>
+            <w:r>
+              <w:rPr>
+                <w:sz w:val="18"/>
+              </w:rPr>
+              <w:t>S1→S8</w:t>
+            </w:r>
+          </w:p>
+        </w:tc>
+      </w:tr>
+      <w:tr>
+        <w:tc>
+          <w:tcPr>
+            <w:tcW w:type="dxa" w:w="6336"/>
+            <w:shd w:val="clear" w:fill="F3F4F6"/>
+          </w:tcPr>
+          <w:p>
+            <w:pPr>
+              <w:spacing w:after="20"/>
+            </w:pPr>
+            <w:r>
+              <w:rPr>
+                <w:sz w:val="18"/>
+              </w:rPr>
+              <w:t>prisma/seed.ts</w:t>
+            </w:r>
+          </w:p>
+        </w:tc>
+        <w:tc>
+          <w:tcPr>
+            <w:tcW w:type="dxa" w:w="1152"/>
+            <w:shd w:val="clear" w:fill="F3F4F6"/>
+          </w:tcPr>
+          <w:p>
+            <w:pPr>
+              <w:spacing w:after="20"/>
+            </w:pPr>
+            <w:r>
+              <w:rPr>
+                <w:sz w:val="18"/>
+              </w:rPr>
+              <w:t>3</w:t>
+            </w:r>
+          </w:p>
+        </w:tc>
+        <w:tc>
+          <w:tcPr>
+            <w:tcW w:type="dxa" w:w="1296"/>
+            <w:shd w:val="clear" w:fill="F3F4F6"/>
+          </w:tcPr>
+          <w:p>
+            <w:pPr>
+              <w:spacing w:after="20"/>
+            </w:pPr>
+            <w:r>
+              <w:rPr>
+                <w:sz w:val="18"/>
+              </w:rPr>
+              <w:t>S2</w:t>
+            </w:r>
+          </w:p>
+        </w:tc>
+      </w:tr>
+      <w:tr>
+        <w:tc>
+          <w:tcPr>
+            <w:tcW w:type="dxa" w:w="6336"/>
+          </w:tcPr>
+          <w:p>
+            <w:pPr>
+              <w:spacing w:after="20"/>
+            </w:pPr>
+            <w:r>
+              <w:rPr>
+                <w:sz w:val="18"/>
+              </w:rPr>
+              <w:t>prisma/normalize-turkish-labels.ts</w:t>
+            </w:r>
+          </w:p>
+        </w:tc>
+        <w:tc>
+          <w:tcPr>
+            <w:tcW w:type="dxa" w:w="1152"/>
+          </w:tcPr>
+          <w:p>
+            <w:pPr>
+              <w:spacing w:after="20"/>
+            </w:pPr>
+            <w:r>
+              <w:rPr>
+                <w:sz w:val="18"/>
+              </w:rPr>
+              <w:t>17 (bakım betiği)</w:t>
+            </w:r>
+          </w:p>
+        </w:tc>
+        <w:tc>
+          <w:tcPr>
+            <w:tcW w:type="dxa" w:w="1296"/>
+          </w:tcPr>
+          <w:p>
+            <w:pPr>
+              <w:spacing w:after="20"/>
+            </w:pPr>
+            <w:r>
+              <w:rPr>
+                <w:sz w:val="18"/>
+              </w:rPr>
+              <w:t>S8</w:t>
+            </w:r>
+          </w:p>
+        </w:tc>
+      </w:tr>
+    </w:tbl>
+    <w:p>
+      <w:pPr>
+        <w:pStyle w:val="Heading2"/>
+      </w:pPr>
+      <w:r>
+        <w:rPr>
+          <w:b/>
+          <w:color w:val="1D4ED8"/>
+          <w:sz w:val="25"/>
+        </w:rPr>
+        <w:t>C) Backend Çekirdek &amp; Güvenlik</w:t>
+      </w:r>
+    </w:p>
+    <w:tbl>
+      <w:tblPr>
+        <w:tblStyle w:val="TableGrid"/>
+        <w:tblW w:type="auto" w:w="0"/>
+        <w:jc w:val="center"/>
+        <w:tblLook w:firstColumn="1" w:firstRow="1" w:lastColumn="0" w:lastRow="0" w:noHBand="0" w:noVBand="1" w:val="04A0"/>
+      </w:tblPr>
+      <w:tblGrid>
+        <w:gridCol w:w="3264"/>
+        <w:gridCol w:w="3264"/>
+        <w:gridCol w:w="3264"/>
+      </w:tblGrid>
+      <w:tr>
+        <w:tc>
+          <w:tcPr>
+            <w:tcW w:type="dxa" w:w="6336"/>
+            <w:shd w:val="clear" w:fill="1D4ED8"/>
+          </w:tcPr>
+          <w:p>
+            <w:r>
+              <w:rPr>
+                <w:b/>
+                <w:color w:val="FFFFFF"/>
+                <w:sz w:val="18"/>
+              </w:rPr>
+              <w:t>Dosya</w:t>
+            </w:r>
+          </w:p>
+        </w:tc>
+        <w:tc>
+          <w:tcPr>
+            <w:tcW w:type="dxa" w:w="1152"/>
+            <w:shd w:val="clear" w:fill="1D4ED8"/>
+          </w:tcPr>
+          <w:p>
+            <w:r>
+              <w:rPr>
+                <w:b/>
+                <w:color w:val="FFFFFF"/>
+                <w:sz w:val="18"/>
+              </w:rPr>
+              <w:t>Gün</w:t>
+            </w:r>
+          </w:p>
+        </w:tc>
+        <w:tc>
+          <w:tcPr>
+            <w:tcW w:type="dxa" w:w="1296"/>
+            <w:shd w:val="clear" w:fill="1D4ED8"/>
+          </w:tcPr>
+          <w:p>
+            <w:r>
+              <w:rPr>
+                <w:b/>
+                <w:color w:val="FFFFFF"/>
+                <w:sz w:val="18"/>
+              </w:rPr>
+              <w:t>Sprint</w:t>
+            </w:r>
+          </w:p>
+        </w:tc>
+      </w:tr>
+      <w:tr>
+        <w:tc>
+          <w:tcPr>
+            <w:tcW w:type="dxa" w:w="6336"/>
+          </w:tcPr>
+          <w:p>
+            <w:pPr>
+              <w:spacing w:after="20"/>
+            </w:pPr>
+            <w:r>
+              <w:rPr>
+                <w:sz w:val="18"/>
+              </w:rPr>
+              <w:t>src/main.ts, src/app.module.ts</w:t>
+            </w:r>
+          </w:p>
+        </w:tc>
+        <w:tc>
+          <w:tcPr>
+            <w:tcW w:type="dxa" w:w="1152"/>
+          </w:tcPr>
+          <w:p>
+            <w:pPr>
+              <w:spacing w:after="20"/>
+            </w:pPr>
+            <w:r>
+              <w:rPr>
+                <w:sz w:val="18"/>
+              </w:rPr>
+              <w:t>1 (app.module modül ekledikçe büyür)</w:t>
+            </w:r>
+          </w:p>
+        </w:tc>
+        <w:tc>
+          <w:tcPr>
+            <w:tcW w:type="dxa" w:w="1296"/>
+          </w:tcPr>
+          <w:p>
+            <w:pPr>
+              <w:spacing w:after="20"/>
+            </w:pPr>
+            <w:r>
+              <w:rPr>
+                <w:sz w:val="18"/>
+              </w:rPr>
+              <w:t>S1</w:t>
+            </w:r>
+          </w:p>
+        </w:tc>
+      </w:tr>
+      <w:tr>
+        <w:tc>
+          <w:tcPr>
+            <w:tcW w:type="dxa" w:w="6336"/>
+            <w:shd w:val="clear" w:fill="F3F4F6"/>
+          </w:tcPr>
+          <w:p>
+            <w:pPr>
+              <w:spacing w:after="20"/>
+            </w:pPr>
+            <w:r>
+              <w:rPr>
+                <w:sz w:val="18"/>
+              </w:rPr>
+              <w:t>src/prisma/prisma.module.ts, prisma.service.ts</w:t>
+            </w:r>
+          </w:p>
+        </w:tc>
+        <w:tc>
+          <w:tcPr>
+            <w:tcW w:type="dxa" w:w="1152"/>
+            <w:shd w:val="clear" w:fill="F3F4F6"/>
+          </w:tcPr>
+          <w:p>
+            <w:pPr>
+              <w:spacing w:after="20"/>
+            </w:pPr>
+            <w:r>
+              <w:rPr>
+                <w:sz w:val="18"/>
+              </w:rPr>
+              <w:t>1</w:t>
+            </w:r>
+          </w:p>
+        </w:tc>
+        <w:tc>
+          <w:tcPr>
+            <w:tcW w:type="dxa" w:w="1296"/>
+            <w:shd w:val="clear" w:fill="F3F4F6"/>
+          </w:tcPr>
+          <w:p>
+            <w:pPr>
+              <w:spacing w:after="20"/>
+            </w:pPr>
+            <w:r>
+              <w:rPr>
+                <w:sz w:val="18"/>
+              </w:rPr>
+              <w:t>S1</w:t>
+            </w:r>
+          </w:p>
+        </w:tc>
+      </w:tr>
+      <w:tr>
+        <w:tc>
+          <w:tcPr>
+            <w:tcW w:type="dxa" w:w="6336"/>
+          </w:tcPr>
+          <w:p>
+            <w:pPr>
+              <w:spacing w:after="20"/>
+            </w:pPr>
+            <w:r>
+              <w:rPr>
+                <w:sz w:val="18"/>
+              </w:rPr>
+              <w:t>src/auth/auth.service.ts, auth.dto.ts, jwt.strategy.ts, auth.module.ts</w:t>
+            </w:r>
+          </w:p>
+        </w:tc>
+        <w:tc>
+          <w:tcPr>
+            <w:tcW w:type="dxa" w:w="1152"/>
+          </w:tcPr>
+          <w:p>
+            <w:pPr>
+              <w:spacing w:after="20"/>
+            </w:pPr>
+            <w:r>
+              <w:rPr>
+                <w:sz w:val="18"/>
+              </w:rPr>
+              <w:t>3</w:t>
+            </w:r>
+          </w:p>
+        </w:tc>
+        <w:tc>
+          <w:tcPr>
+            <w:tcW w:type="dxa" w:w="1296"/>
+          </w:tcPr>
+          <w:p>
+            <w:pPr>
+              <w:spacing w:after="20"/>
+            </w:pPr>
+            <w:r>
+              <w:rPr>
+                <w:sz w:val="18"/>
+              </w:rPr>
+              <w:t>S2</w:t>
+            </w:r>
+          </w:p>
+        </w:tc>
+      </w:tr>
+      <w:tr>
+        <w:tc>
+          <w:tcPr>
+            <w:tcW w:type="dxa" w:w="6336"/>
+            <w:shd w:val="clear" w:fill="F3F4F6"/>
+          </w:tcPr>
+          <w:p>
+            <w:pPr>
+              <w:spacing w:after="20"/>
+            </w:pPr>
+            <w:r>
+              <w:rPr>
+                <w:sz w:val="18"/>
+              </w:rPr>
+              <w:t>src/auth/auth.controller.ts</w:t>
+            </w:r>
+          </w:p>
+        </w:tc>
+        <w:tc>
+          <w:tcPr>
+            <w:tcW w:type="dxa" w:w="1152"/>
+            <w:shd w:val="clear" w:fill="F3F4F6"/>
+          </w:tcPr>
+          <w:p>
+            <w:pPr>
+              <w:spacing w:after="20"/>
+            </w:pPr>
+            <w:r>
+              <w:rPr>
+                <w:sz w:val="18"/>
+              </w:rPr>
+              <w:t>4</w:t>
+            </w:r>
+          </w:p>
+        </w:tc>
+        <w:tc>
+          <w:tcPr>
+            <w:tcW w:type="dxa" w:w="1296"/>
+            <w:shd w:val="clear" w:fill="F3F4F6"/>
+          </w:tcPr>
+          <w:p>
+            <w:pPr>
+              <w:spacing w:after="20"/>
+            </w:pPr>
+            <w:r>
+              <w:rPr>
+                <w:sz w:val="18"/>
+              </w:rPr>
+              <w:t>S2</w:t>
+            </w:r>
+          </w:p>
+        </w:tc>
+      </w:tr>
+      <w:tr>
+        <w:tc>
+          <w:tcPr>
+            <w:tcW w:type="dxa" w:w="6336"/>
+          </w:tcPr>
+          <w:p>
+            <w:pPr>
+              <w:spacing w:after="20"/>
+            </w:pPr>
+            <w:r>
+              <w:rPr>
+                <w:sz w:val="18"/>
+              </w:rPr>
+              <w:t>src/common/guards/jwt-auth.guard.ts, permissions.guard.ts</w:t>
+            </w:r>
+          </w:p>
+        </w:tc>
+        <w:tc>
+          <w:tcPr>
+            <w:tcW w:type="dxa" w:w="1152"/>
+          </w:tcPr>
+          <w:p>
+            <w:pPr>
+              <w:spacing w:after="20"/>
+            </w:pPr>
+            <w:r>
+              <w:rPr>
+                <w:sz w:val="18"/>
+              </w:rPr>
+              <w:t>4</w:t>
+            </w:r>
+          </w:p>
+        </w:tc>
+        <w:tc>
+          <w:tcPr>
+            <w:tcW w:type="dxa" w:w="1296"/>
+          </w:tcPr>
+          <w:p>
+            <w:pPr>
+              <w:spacing w:after="20"/>
+            </w:pPr>
+            <w:r>
+              <w:rPr>
+                <w:sz w:val="18"/>
+              </w:rPr>
+              <w:t>S2</w:t>
+            </w:r>
+          </w:p>
+        </w:tc>
+      </w:tr>
+      <w:tr>
+        <w:tc>
+          <w:tcPr>
+            <w:tcW w:type="dxa" w:w="6336"/>
+            <w:shd w:val="clear" w:fill="F3F4F6"/>
+          </w:tcPr>
+          <w:p>
+            <w:pPr>
+              <w:spacing w:after="20"/>
+            </w:pPr>
+            <w:r>
+              <w:rPr>
+                <w:sz w:val="18"/>
+              </w:rPr>
+              <w:t>src/common/decorators/current-user.decorator.ts, permissions.decorator.ts</w:t>
+            </w:r>
+          </w:p>
+        </w:tc>
+        <w:tc>
+          <w:tcPr>
+            <w:tcW w:type="dxa" w:w="1152"/>
+            <w:shd w:val="clear" w:fill="F3F4F6"/>
+          </w:tcPr>
+          <w:p>
+            <w:pPr>
+              <w:spacing w:after="20"/>
+            </w:pPr>
+            <w:r>
+              <w:rPr>
+                <w:sz w:val="18"/>
+              </w:rPr>
+              <w:t>4</w:t>
+            </w:r>
+          </w:p>
+        </w:tc>
+        <w:tc>
+          <w:tcPr>
+            <w:tcW w:type="dxa" w:w="1296"/>
+            <w:shd w:val="clear" w:fill="F3F4F6"/>
+          </w:tcPr>
+          <w:p>
+            <w:pPr>
+              <w:spacing w:after="20"/>
+            </w:pPr>
+            <w:r>
+              <w:rPr>
+                <w:sz w:val="18"/>
+              </w:rPr>
+              <w:t>S2</w:t>
+            </w:r>
+          </w:p>
+        </w:tc>
+      </w:tr>
+    </w:tbl>
+    <w:p>
+      <w:pPr>
+        <w:pStyle w:val="Heading2"/>
+      </w:pPr>
+      <w:r>
+        <w:rPr>
+          <w:b/>
+          <w:color w:val="1D4ED8"/>
+          <w:sz w:val="25"/>
+        </w:rPr>
+        <w:t>D) Backend Modülleri</w:t>
+      </w:r>
+    </w:p>
+    <w:tbl>
+      <w:tblPr>
+        <w:tblStyle w:val="TableGrid"/>
+        <w:tblW w:type="auto" w:w="0"/>
+        <w:jc w:val="center"/>
+        <w:tblLook w:firstColumn="1" w:firstRow="1" w:lastColumn="0" w:lastRow="0" w:noHBand="0" w:noVBand="1" w:val="04A0"/>
+      </w:tblPr>
+      <w:tblGrid>
+        <w:gridCol w:w="3264"/>
+        <w:gridCol w:w="3264"/>
+        <w:gridCol w:w="3264"/>
+      </w:tblGrid>
+      <w:tr>
+        <w:tc>
+          <w:tcPr>
+            <w:tcW w:type="dxa" w:w="6336"/>
+            <w:shd w:val="clear" w:fill="1D4ED8"/>
+          </w:tcPr>
+          <w:p>
+            <w:r>
+              <w:rPr>
+                <w:b/>
+                <w:color w:val="FFFFFF"/>
+                <w:sz w:val="18"/>
+              </w:rPr>
+              <w:t>Dosya</w:t>
+            </w:r>
+          </w:p>
+        </w:tc>
+        <w:tc>
+          <w:tcPr>
+            <w:tcW w:type="dxa" w:w="1296"/>
+            <w:shd w:val="clear" w:fill="1D4ED8"/>
+          </w:tcPr>
+          <w:p>
+            <w:r>
+              <w:rPr>
+                <w:b/>
+                <w:color w:val="FFFFFF"/>
+                <w:sz w:val="18"/>
+              </w:rPr>
+              <w:t>Gün</w:t>
+            </w:r>
+          </w:p>
+        </w:tc>
+        <w:tc>
+          <w:tcPr>
+            <w:tcW w:type="dxa" w:w="1152"/>
+            <w:shd w:val="clear" w:fill="1D4ED8"/>
+          </w:tcPr>
+          <w:p>
+            <w:r>
+              <w:rPr>
+                <w:b/>
+                <w:color w:val="FFFFFF"/>
+                <w:sz w:val="18"/>
+              </w:rPr>
+              <w:t>Sprint</w:t>
+            </w:r>
+          </w:p>
+        </w:tc>
+      </w:tr>
+      <w:tr>
+        <w:tc>
+          <w:tcPr>
+            <w:tcW w:type="dxa" w:w="6336"/>
+          </w:tcPr>
+          <w:p>
+            <w:pPr>
+              <w:spacing w:after="20"/>
+            </w:pPr>
+            <w:r>
+              <w:rPr>
+                <w:sz w:val="18"/>
+              </w:rPr>
+              <w:t>src/roles/roles.controller.ts, roles.module.ts</w:t>
+            </w:r>
+          </w:p>
+        </w:tc>
+        <w:tc>
+          <w:tcPr>
+            <w:tcW w:type="dxa" w:w="1296"/>
+          </w:tcPr>
+          <w:p>
+            <w:pPr>
+              <w:spacing w:after="20"/>
+            </w:pPr>
+            <w:r>
+              <w:rPr>
+                <w:sz w:val="18"/>
+              </w:rPr>
+              <w:t>5</w:t>
+            </w:r>
+          </w:p>
+        </w:tc>
+        <w:tc>
+          <w:tcPr>
+            <w:tcW w:type="dxa" w:w="1152"/>
+          </w:tcPr>
+          <w:p>
+            <w:pPr>
+              <w:spacing w:after="20"/>
+            </w:pPr>
+            <w:r>
+              <w:rPr>
+                <w:sz w:val="18"/>
+              </w:rPr>
+              <w:t>S3</w:t>
+            </w:r>
+          </w:p>
+        </w:tc>
+      </w:tr>
+      <w:tr>
+        <w:tc>
+          <w:tcPr>
+            <w:tcW w:type="dxa" w:w="6336"/>
+            <w:shd w:val="clear" w:fill="F3F4F6"/>
+          </w:tcPr>
+          <w:p>
+            <w:pPr>
+              <w:spacing w:after="20"/>
+            </w:pPr>
+            <w:r>
+              <w:rPr>
+                <w:sz w:val="18"/>
+              </w:rPr>
+              <w:t>src/departments/departments.controller.ts, departments.module.ts</w:t>
+            </w:r>
+          </w:p>
+        </w:tc>
+        <w:tc>
+          <w:tcPr>
+            <w:tcW w:type="dxa" w:w="1296"/>
+            <w:shd w:val="clear" w:fill="F3F4F6"/>
+          </w:tcPr>
+          <w:p>
+            <w:pPr>
+              <w:spacing w:after="20"/>
+            </w:pPr>
+            <w:r>
+              <w:rPr>
+                <w:sz w:val="18"/>
+              </w:rPr>
+              <w:t>5</w:t>
+            </w:r>
+          </w:p>
+        </w:tc>
+        <w:tc>
+          <w:tcPr>
+            <w:tcW w:type="dxa" w:w="1152"/>
+            <w:shd w:val="clear" w:fill="F3F4F6"/>
+          </w:tcPr>
+          <w:p>
+            <w:pPr>
+              <w:spacing w:after="20"/>
+            </w:pPr>
+            <w:r>
+              <w:rPr>
+                <w:sz w:val="18"/>
+              </w:rPr>
+              <w:t>S3</w:t>
+            </w:r>
+          </w:p>
+        </w:tc>
+      </w:tr>
+      <w:tr>
+        <w:tc>
+          <w:tcPr>
+            <w:tcW w:type="dxa" w:w="6336"/>
+          </w:tcPr>
+          <w:p>
+            <w:pPr>
+              <w:spacing w:after="20"/>
+            </w:pPr>
+            <w:r>
+              <w:rPr>
+                <w:sz w:val="18"/>
+              </w:rPr>
+              <w:t>src/users/users.service.ts, users.controller.ts, user.dto.ts, users.module.ts</w:t>
+            </w:r>
+          </w:p>
+        </w:tc>
+        <w:tc>
+          <w:tcPr>
+            <w:tcW w:type="dxa" w:w="1296"/>
+          </w:tcPr>
+          <w:p>
+            <w:pPr>
+              <w:spacing w:after="20"/>
+            </w:pPr>
+            <w:r>
+              <w:rPr>
+                <w:sz w:val="18"/>
+              </w:rPr>
+              <w:t>6</w:t>
+            </w:r>
+          </w:p>
+        </w:tc>
+        <w:tc>
+          <w:tcPr>
+            <w:tcW w:type="dxa" w:w="1152"/>
+          </w:tcPr>
+          <w:p>
+            <w:pPr>
+              <w:spacing w:after="20"/>
+            </w:pPr>
+            <w:r>
+              <w:rPr>
+                <w:sz w:val="18"/>
+              </w:rPr>
+              <w:t>S3</w:t>
+            </w:r>
+          </w:p>
+        </w:tc>
+      </w:tr>
+      <w:tr>
+        <w:tc>
+          <w:tcPr>
+            <w:tcW w:type="dxa" w:w="6336"/>
+            <w:shd w:val="clear" w:fill="F3F4F6"/>
+          </w:tcPr>
+          <w:p>
+            <w:pPr>
+              <w:spacing w:after="20"/>
+            </w:pPr>
+            <w:r>
+              <w:rPr>
+                <w:sz w:val="18"/>
+              </w:rPr>
+              <w:t>src/reports/reports.module.ts, reports.controller.ts, report.dto.ts</w:t>
+            </w:r>
+          </w:p>
+        </w:tc>
+        <w:tc>
+          <w:tcPr>
+            <w:tcW w:type="dxa" w:w="1296"/>
+            <w:shd w:val="clear" w:fill="F3F4F6"/>
+          </w:tcPr>
+          <w:p>
+            <w:pPr>
+              <w:spacing w:after="20"/>
+            </w:pPr>
+            <w:r>
+              <w:rPr>
+                <w:sz w:val="18"/>
+              </w:rPr>
+              <w:t>8 → 10,12 (büyür)</w:t>
+            </w:r>
+          </w:p>
+        </w:tc>
+        <w:tc>
+          <w:tcPr>
+            <w:tcW w:type="dxa" w:w="1152"/>
+            <w:shd w:val="clear" w:fill="F3F4F6"/>
+          </w:tcPr>
+          <w:p>
+            <w:pPr>
+              <w:spacing w:after="20"/>
+            </w:pPr>
+            <w:r>
+              <w:rPr>
+                <w:sz w:val="18"/>
+              </w:rPr>
+              <w:t>S4→S6</w:t>
+            </w:r>
+          </w:p>
+        </w:tc>
+      </w:tr>
+      <w:tr>
+        <w:tc>
+          <w:tcPr>
+            <w:tcW w:type="dxa" w:w="6336"/>
+          </w:tcPr>
+          <w:p>
+            <w:pPr>
+              <w:spacing w:after="20"/>
+            </w:pPr>
+            <w:r>
+              <w:rPr>
+                <w:sz w:val="18"/>
+              </w:rPr>
+              <w:t>src/reports/reports.service.ts</w:t>
+            </w:r>
+          </w:p>
+        </w:tc>
+        <w:tc>
+          <w:tcPr>
+            <w:tcW w:type="dxa" w:w="1296"/>
+          </w:tcPr>
+          <w:p>
+            <w:pPr>
+              <w:spacing w:after="20"/>
+            </w:pPr>
+            <w:r>
+              <w:rPr>
+                <w:sz w:val="18"/>
+              </w:rPr>
+              <w:t>8 → 10 → 12 (büyür)</w:t>
+            </w:r>
+          </w:p>
+        </w:tc>
+        <w:tc>
+          <w:tcPr>
+            <w:tcW w:type="dxa" w:w="1152"/>
+          </w:tcPr>
+          <w:p>
+            <w:pPr>
+              <w:spacing w:after="20"/>
+            </w:pPr>
+            <w:r>
+              <w:rPr>
+                <w:sz w:val="18"/>
+              </w:rPr>
+              <w:t>S4→S6</w:t>
+            </w:r>
+          </w:p>
+        </w:tc>
+      </w:tr>
+      <w:tr>
+        <w:tc>
+          <w:tcPr>
+            <w:tcW w:type="dxa" w:w="6336"/>
+            <w:shd w:val="clear" w:fill="F3F4F6"/>
+          </w:tcPr>
+          <w:p>
+            <w:pPr>
+              <w:spacing w:after="20"/>
+            </w:pPr>
+            <w:r>
+              <w:rPr>
+                <w:sz w:val="18"/>
+              </w:rPr>
+              <w:t>src/reports/report-status.ts, report-access.ts</w:t>
+            </w:r>
+          </w:p>
+        </w:tc>
+        <w:tc>
+          <w:tcPr>
+            <w:tcW w:type="dxa" w:w="1296"/>
+            <w:shd w:val="clear" w:fill="F3F4F6"/>
+          </w:tcPr>
+          <w:p>
+            <w:pPr>
+              <w:spacing w:after="20"/>
+            </w:pPr>
+            <w:r>
+              <w:rPr>
+                <w:sz w:val="18"/>
+              </w:rPr>
+              <w:t>12</w:t>
+            </w:r>
+          </w:p>
+        </w:tc>
+        <w:tc>
+          <w:tcPr>
+            <w:tcW w:type="dxa" w:w="1152"/>
+            <w:shd w:val="clear" w:fill="F3F4F6"/>
+          </w:tcPr>
+          <w:p>
+            <w:pPr>
+              <w:spacing w:after="20"/>
+            </w:pPr>
+            <w:r>
+              <w:rPr>
+                <w:sz w:val="18"/>
+              </w:rPr>
+              <w:t>S6</w:t>
+            </w:r>
+          </w:p>
+        </w:tc>
+      </w:tr>
+      <w:tr>
+        <w:tc>
+          <w:tcPr>
+            <w:tcW w:type="dxa" w:w="6336"/>
+          </w:tcPr>
+          <w:p>
+            <w:pPr>
+              <w:spacing w:after="20"/>
+            </w:pPr>
+            <w:r>
+              <w:rPr>
+                <w:sz w:val="18"/>
+              </w:rPr>
+              <w:t>src/notifications/notifications.service.ts, controller.ts, module.ts</w:t>
+            </w:r>
+          </w:p>
+        </w:tc>
+        <w:tc>
+          <w:tcPr>
+            <w:tcW w:type="dxa" w:w="1296"/>
+          </w:tcPr>
+          <w:p>
+            <w:pPr>
+              <w:spacing w:after="20"/>
+            </w:pPr>
+            <w:r>
+              <w:rPr>
+                <w:sz w:val="18"/>
+              </w:rPr>
+              <w:t>13</w:t>
+            </w:r>
+          </w:p>
+        </w:tc>
+        <w:tc>
+          <w:tcPr>
+            <w:tcW w:type="dxa" w:w="1152"/>
+          </w:tcPr>
+          <w:p>
+            <w:pPr>
+              <w:spacing w:after="20"/>
+            </w:pPr>
+            <w:r>
+              <w:rPr>
+                <w:sz w:val="18"/>
+              </w:rPr>
+              <w:t>S6</w:t>
+            </w:r>
+          </w:p>
+        </w:tc>
+      </w:tr>
+      <w:tr>
+        <w:tc>
+          <w:tcPr>
+            <w:tcW w:type="dxa" w:w="6336"/>
+            <w:shd w:val="clear" w:fill="F3F4F6"/>
+          </w:tcPr>
+          <w:p>
+            <w:pPr>
+              <w:spacing w:after="20"/>
+            </w:pPr>
+            <w:r>
+              <w:rPr>
+                <w:sz w:val="18"/>
+              </w:rPr>
+              <w:t>src/storage/storage.service.ts, storage.module.ts</w:t>
+            </w:r>
+          </w:p>
+        </w:tc>
+        <w:tc>
+          <w:tcPr>
+            <w:tcW w:type="dxa" w:w="1296"/>
+            <w:shd w:val="clear" w:fill="F3F4F6"/>
+          </w:tcPr>
+          <w:p>
+            <w:pPr>
+              <w:spacing w:after="20"/>
+            </w:pPr>
+            <w:r>
+              <w:rPr>
+                <w:sz w:val="18"/>
+              </w:rPr>
+              <w:t>14</w:t>
+            </w:r>
+          </w:p>
+        </w:tc>
+        <w:tc>
+          <w:tcPr>
+            <w:tcW w:type="dxa" w:w="1152"/>
+            <w:shd w:val="clear" w:fill="F3F4F6"/>
+          </w:tcPr>
+          <w:p>
+            <w:pPr>
+              <w:spacing w:after="20"/>
+            </w:pPr>
+            <w:r>
+              <w:rPr>
+                <w:sz w:val="18"/>
+              </w:rPr>
+              <w:t>S7</w:t>
+            </w:r>
+          </w:p>
+        </w:tc>
+      </w:tr>
+      <w:tr>
+        <w:tc>
+          <w:tcPr>
+            <w:tcW w:type="dxa" w:w="6336"/>
+          </w:tcPr>
+          <w:p>
+            <w:pPr>
+              <w:spacing w:after="20"/>
+            </w:pPr>
+            <w:r>
+              <w:rPr>
+                <w:sz w:val="18"/>
+              </w:rPr>
+              <w:t>src/uploads/uploads.controller.ts, uploads.module.ts</w:t>
+            </w:r>
+          </w:p>
+        </w:tc>
+        <w:tc>
+          <w:tcPr>
+            <w:tcW w:type="dxa" w:w="1296"/>
+          </w:tcPr>
+          <w:p>
+            <w:pPr>
+              <w:spacing w:after="20"/>
+            </w:pPr>
+            <w:r>
+              <w:rPr>
+                <w:sz w:val="18"/>
+              </w:rPr>
+              <w:t>14</w:t>
+            </w:r>
+          </w:p>
+        </w:tc>
+        <w:tc>
+          <w:tcPr>
+            <w:tcW w:type="dxa" w:w="1152"/>
+          </w:tcPr>
+          <w:p>
+            <w:pPr>
+              <w:spacing w:after="20"/>
+            </w:pPr>
+            <w:r>
+              <w:rPr>
+                <w:sz w:val="18"/>
+              </w:rPr>
+              <w:t>S7</w:t>
+            </w:r>
+          </w:p>
+        </w:tc>
+      </w:tr>
+      <w:tr>
+        <w:tc>
+          <w:tcPr>
+            <w:tcW w:type="dxa" w:w="6336"/>
+            <w:shd w:val="clear" w:fill="F3F4F6"/>
+          </w:tcPr>
+          <w:p>
+            <w:pPr>
+              <w:spacing w:after="20"/>
+            </w:pPr>
+            <w:r>
+              <w:rPr>
+                <w:sz w:val="18"/>
+              </w:rPr>
+              <w:t>src/uploads/files.controller.ts</w:t>
+            </w:r>
+          </w:p>
+        </w:tc>
+        <w:tc>
+          <w:tcPr>
+            <w:tcW w:type="dxa" w:w="1296"/>
+            <w:shd w:val="clear" w:fill="F3F4F6"/>
+          </w:tcPr>
+          <w:p>
+            <w:pPr>
+              <w:spacing w:after="20"/>
+            </w:pPr>
+            <w:r>
+              <w:rPr>
+                <w:sz w:val="18"/>
+              </w:rPr>
+              <w:t>15</w:t>
+            </w:r>
+          </w:p>
+        </w:tc>
+        <w:tc>
+          <w:tcPr>
+            <w:tcW w:type="dxa" w:w="1152"/>
+            <w:shd w:val="clear" w:fill="F3F4F6"/>
+          </w:tcPr>
+          <w:p>
+            <w:pPr>
+              <w:spacing w:after="20"/>
+            </w:pPr>
+            <w:r>
+              <w:rPr>
+                <w:sz w:val="18"/>
+              </w:rPr>
+              <w:t>S7</w:t>
+            </w:r>
+          </w:p>
+        </w:tc>
+      </w:tr>
+      <w:tr>
+        <w:tc>
+          <w:tcPr>
+            <w:tcW w:type="dxa" w:w="6336"/>
+          </w:tcPr>
+          <w:p>
+            <w:pPr>
+              <w:spacing w:after="20"/>
+            </w:pPr>
+            <w:r>
+              <w:rPr>
+                <w:sz w:val="18"/>
+              </w:rPr>
+              <w:t>src/audit/audit.service.ts, audit.controller.ts, audit.module.ts</w:t>
+            </w:r>
+          </w:p>
+        </w:tc>
+        <w:tc>
+          <w:tcPr>
+            <w:tcW w:type="dxa" w:w="1296"/>
+          </w:tcPr>
+          <w:p>
+            <w:pPr>
+              <w:spacing w:after="20"/>
+            </w:pPr>
+            <w:r>
+              <w:rPr>
+                <w:sz w:val="18"/>
+              </w:rPr>
+              <w:t>16</w:t>
+            </w:r>
+          </w:p>
+        </w:tc>
+        <w:tc>
+          <w:tcPr>
+            <w:tcW w:type="dxa" w:w="1152"/>
+          </w:tcPr>
+          <w:p>
+            <w:pPr>
+              <w:spacing w:after="20"/>
+            </w:pPr>
+            <w:r>
+              <w:rPr>
+                <w:sz w:val="18"/>
+              </w:rPr>
+              <w:t>S8</w:t>
+            </w:r>
+          </w:p>
+        </w:tc>
+      </w:tr>
+    </w:tbl>
+    <w:p>
+      <w:pPr>
+        <w:pStyle w:val="Heading2"/>
+      </w:pPr>
+      <w:r>
+        <w:rPr>
+          <w:b/>
+          <w:color w:val="B45309"/>
+          <w:sz w:val="25"/>
+        </w:rPr>
+        <w:t>E) Frontend — Sayfalar (pages/)</w:t>
+      </w:r>
+    </w:p>
+    <w:tbl>
+      <w:tblPr>
+        <w:tblStyle w:val="TableGrid"/>
+        <w:tblW w:type="auto" w:w="0"/>
+        <w:jc w:val="center"/>
+        <w:tblLook w:firstColumn="1" w:firstRow="1" w:lastColumn="0" w:lastRow="0" w:noHBand="0" w:noVBand="1" w:val="04A0"/>
+      </w:tblPr>
+      <w:tblGrid>
+        <w:gridCol w:w="3264"/>
+        <w:gridCol w:w="3264"/>
+        <w:gridCol w:w="3264"/>
+      </w:tblGrid>
+      <w:tr>
+        <w:tc>
+          <w:tcPr>
+            <w:tcW w:type="dxa" w:w="6336"/>
+            <w:shd w:val="clear" w:fill="B45309"/>
+          </w:tcPr>
+          <w:p>
+            <w:r>
+              <w:rPr>
+                <w:b/>
+                <w:color w:val="FFFFFF"/>
+                <w:sz w:val="18"/>
+              </w:rPr>
+              <w:t>Dosya</w:t>
+            </w:r>
+          </w:p>
+        </w:tc>
+        <w:tc>
+          <w:tcPr>
+            <w:tcW w:type="dxa" w:w="1152"/>
+            <w:shd w:val="clear" w:fill="B45309"/>
+          </w:tcPr>
+          <w:p>
+            <w:r>
+              <w:rPr>
+                <w:b/>
+                <w:color w:val="FFFFFF"/>
+                <w:sz w:val="18"/>
+              </w:rPr>
+              <w:t>Gün</w:t>
+            </w:r>
+          </w:p>
+        </w:tc>
+        <w:tc>
+          <w:tcPr>
+            <w:tcW w:type="dxa" w:w="1296"/>
+            <w:shd w:val="clear" w:fill="B45309"/>
+          </w:tcPr>
+          <w:p>
+            <w:r>
+              <w:rPr>
+                <w:b/>
+                <w:color w:val="FFFFFF"/>
+                <w:sz w:val="18"/>
+              </w:rPr>
+              <w:t>Sprint</w:t>
+            </w:r>
+          </w:p>
+        </w:tc>
+      </w:tr>
+      <w:tr>
+        <w:tc>
+          <w:tcPr>
+            <w:tcW w:type="dxa" w:w="6336"/>
+          </w:tcPr>
+          <w:p>
+            <w:pPr>
+              <w:spacing w:after="20"/>
+            </w:pPr>
+            <w:r>
+              <w:rPr>
+                <w:sz w:val="18"/>
+              </w:rPr>
+              <w:t>LoginPage.tsx, RegisterPage.tsx, PendingPage.tsx</w:t>
+            </w:r>
+          </w:p>
+        </w:tc>
+        <w:tc>
+          <w:tcPr>
+            <w:tcW w:type="dxa" w:w="1152"/>
+          </w:tcPr>
+          <w:p>
+            <w:pPr>
+              <w:spacing w:after="20"/>
+            </w:pPr>
+            <w:r>
+              <w:rPr>
+                <w:sz w:val="18"/>
+              </w:rPr>
+              <w:t>4</w:t>
+            </w:r>
+          </w:p>
+        </w:tc>
+        <w:tc>
+          <w:tcPr>
+            <w:tcW w:type="dxa" w:w="1296"/>
+          </w:tcPr>
+          <w:p>
+            <w:pPr>
+              <w:spacing w:after="20"/>
+            </w:pPr>
+            <w:r>
+              <w:rPr>
+                <w:sz w:val="18"/>
+              </w:rPr>
+              <w:t>S2</w:t>
+            </w:r>
+          </w:p>
+        </w:tc>
+      </w:tr>
+      <w:tr>
+        <w:tc>
+          <w:tcPr>
+            <w:tcW w:type="dxa" w:w="6336"/>
+            <w:shd w:val="clear" w:fill="F3F4F6"/>
+          </w:tcPr>
+          <w:p>
+            <w:pPr>
+              <w:spacing w:after="20"/>
+            </w:pPr>
+            <w:r>
+              <w:rPr>
+                <w:sz w:val="18"/>
+              </w:rPr>
+              <w:t>AdminUsersPage.tsx, AdminRolesPage.tsx, AdminDepartmentsPage.tsx</w:t>
+            </w:r>
+          </w:p>
+        </w:tc>
+        <w:tc>
+          <w:tcPr>
+            <w:tcW w:type="dxa" w:w="1152"/>
+            <w:shd w:val="clear" w:fill="F3F4F6"/>
+          </w:tcPr>
+          <w:p>
+            <w:pPr>
+              <w:spacing w:after="20"/>
+            </w:pPr>
+            <w:r>
+              <w:rPr>
+                <w:sz w:val="18"/>
+              </w:rPr>
+              <w:t>7</w:t>
+            </w:r>
+          </w:p>
+        </w:tc>
+        <w:tc>
+          <w:tcPr>
+            <w:tcW w:type="dxa" w:w="1296"/>
+            <w:shd w:val="clear" w:fill="F3F4F6"/>
+          </w:tcPr>
+          <w:p>
+            <w:pPr>
+              <w:spacing w:after="20"/>
+            </w:pPr>
+            <w:r>
+              <w:rPr>
+                <w:sz w:val="18"/>
+              </w:rPr>
+              <w:t>S3</w:t>
+            </w:r>
+          </w:p>
+        </w:tc>
+      </w:tr>
+      <w:tr>
+        <w:tc>
+          <w:tcPr>
+            <w:tcW w:type="dxa" w:w="6336"/>
+          </w:tcPr>
+          <w:p>
+            <w:pPr>
+              <w:spacing w:after="20"/>
+            </w:pPr>
+            <w:r>
+              <w:rPr>
+                <w:sz w:val="18"/>
+              </w:rPr>
+              <w:t>AccidentFormPage.tsx</w:t>
+            </w:r>
+          </w:p>
+        </w:tc>
+        <w:tc>
+          <w:tcPr>
+            <w:tcW w:type="dxa" w:w="1152"/>
+          </w:tcPr>
+          <w:p>
+            <w:pPr>
+              <w:spacing w:after="20"/>
+            </w:pPr>
+            <w:r>
+              <w:rPr>
+                <w:sz w:val="18"/>
+              </w:rPr>
+              <w:t>9</w:t>
+            </w:r>
+          </w:p>
+        </w:tc>
+        <w:tc>
+          <w:tcPr>
+            <w:tcW w:type="dxa" w:w="1296"/>
+          </w:tcPr>
+          <w:p>
+            <w:pPr>
+              <w:spacing w:after="20"/>
+            </w:pPr>
+            <w:r>
+              <w:rPr>
+                <w:sz w:val="18"/>
+              </w:rPr>
+              <w:t>S4</w:t>
+            </w:r>
+          </w:p>
+        </w:tc>
+      </w:tr>
+      <w:tr>
+        <w:tc>
+          <w:tcPr>
+            <w:tcW w:type="dxa" w:w="6336"/>
+            <w:shd w:val="clear" w:fill="F3F4F6"/>
+          </w:tcPr>
+          <w:p>
+            <w:pPr>
+              <w:spacing w:after="20"/>
+            </w:pPr>
+            <w:r>
+              <w:rPr>
+                <w:sz w:val="18"/>
+              </w:rPr>
+              <w:t>NearMissFormPage.tsx</w:t>
+            </w:r>
+          </w:p>
+        </w:tc>
+        <w:tc>
+          <w:tcPr>
+            <w:tcW w:type="dxa" w:w="1152"/>
+            <w:shd w:val="clear" w:fill="F3F4F6"/>
+          </w:tcPr>
+          <w:p>
+            <w:pPr>
+              <w:spacing w:after="20"/>
+            </w:pPr>
+            <w:r>
+              <w:rPr>
+                <w:sz w:val="18"/>
+              </w:rPr>
+              <w:t>11</w:t>
+            </w:r>
+          </w:p>
+        </w:tc>
+        <w:tc>
+          <w:tcPr>
+            <w:tcW w:type="dxa" w:w="1296"/>
+            <w:shd w:val="clear" w:fill="F3F4F6"/>
+          </w:tcPr>
+          <w:p>
+            <w:pPr>
+              <w:spacing w:after="20"/>
+            </w:pPr>
+            <w:r>
+              <w:rPr>
+                <w:sz w:val="18"/>
+              </w:rPr>
+              <w:t>S5</w:t>
+            </w:r>
+          </w:p>
+        </w:tc>
+      </w:tr>
+      <w:tr>
+        <w:tc>
+          <w:tcPr>
+            <w:tcW w:type="dxa" w:w="6336"/>
+          </w:tcPr>
+          <w:p>
+            <w:pPr>
+              <w:spacing w:after="20"/>
+            </w:pPr>
+            <w:r>
+              <w:rPr>
+                <w:sz w:val="18"/>
+              </w:rPr>
+              <w:t>ReportsListPage.tsx, ReportDetailPage.tsx</w:t>
+            </w:r>
+          </w:p>
+        </w:tc>
+        <w:tc>
+          <w:tcPr>
+            <w:tcW w:type="dxa" w:w="1152"/>
+          </w:tcPr>
+          <w:p>
+            <w:pPr>
+              <w:spacing w:after="20"/>
+            </w:pPr>
+            <w:r>
+              <w:rPr>
+                <w:sz w:val="18"/>
+              </w:rPr>
+              <w:t>13</w:t>
+            </w:r>
+          </w:p>
+        </w:tc>
+        <w:tc>
+          <w:tcPr>
+            <w:tcW w:type="dxa" w:w="1296"/>
+          </w:tcPr>
+          <w:p>
+            <w:pPr>
+              <w:spacing w:after="20"/>
+            </w:pPr>
+            <w:r>
+              <w:rPr>
+                <w:sz w:val="18"/>
+              </w:rPr>
+              <w:t>S6</w:t>
+            </w:r>
+          </w:p>
+        </w:tc>
+      </w:tr>
+      <w:tr>
+        <w:tc>
+          <w:tcPr>
+            <w:tcW w:type="dxa" w:w="6336"/>
+            <w:shd w:val="clear" w:fill="F3F4F6"/>
+          </w:tcPr>
+          <w:p>
+            <w:pPr>
+              <w:spacing w:after="20"/>
+            </w:pPr>
+            <w:r>
+              <w:rPr>
+                <w:sz w:val="18"/>
+              </w:rPr>
+              <w:t>AdminAuditPage.tsx</w:t>
+            </w:r>
+          </w:p>
+        </w:tc>
+        <w:tc>
+          <w:tcPr>
+            <w:tcW w:type="dxa" w:w="1152"/>
+            <w:shd w:val="clear" w:fill="F3F4F6"/>
+          </w:tcPr>
+          <w:p>
+            <w:pPr>
+              <w:spacing w:after="20"/>
+            </w:pPr>
+            <w:r>
+              <w:rPr>
+                <w:sz w:val="18"/>
+              </w:rPr>
+              <w:t>16</w:t>
+            </w:r>
+          </w:p>
+        </w:tc>
+        <w:tc>
+          <w:tcPr>
+            <w:tcW w:type="dxa" w:w="1296"/>
+            <w:shd w:val="clear" w:fill="F3F4F6"/>
+          </w:tcPr>
+          <w:p>
+            <w:pPr>
+              <w:spacing w:after="20"/>
+            </w:pPr>
+            <w:r>
+              <w:rPr>
+                <w:sz w:val="18"/>
+              </w:rPr>
+              <w:t>S8</w:t>
+            </w:r>
+          </w:p>
+        </w:tc>
+      </w:tr>
+      <w:tr>
+        <w:tc>
+          <w:tcPr>
+            <w:tcW w:type="dxa" w:w="6336"/>
+          </w:tcPr>
+          <w:p>
+            <w:pPr>
+              <w:spacing w:after="20"/>
+            </w:pPr>
+            <w:r>
+              <w:rPr>
+                <w:sz w:val="18"/>
+              </w:rPr>
+              <w:t>DashboardPage.tsx, ProfilePage.tsx</w:t>
+            </w:r>
+          </w:p>
+        </w:tc>
+        <w:tc>
+          <w:tcPr>
+            <w:tcW w:type="dxa" w:w="1152"/>
+          </w:tcPr>
+          <w:p>
+            <w:pPr>
+              <w:spacing w:after="20"/>
+            </w:pPr>
+            <w:r>
+              <w:rPr>
+                <w:sz w:val="18"/>
+              </w:rPr>
+              <w:t>17</w:t>
+            </w:r>
+          </w:p>
+        </w:tc>
+        <w:tc>
+          <w:tcPr>
+            <w:tcW w:type="dxa" w:w="1296"/>
+          </w:tcPr>
+          <w:p>
+            <w:pPr>
+              <w:spacing w:after="20"/>
+            </w:pPr>
+            <w:r>
+              <w:rPr>
+                <w:sz w:val="18"/>
+              </w:rPr>
+              <w:t>S8</w:t>
+            </w:r>
+          </w:p>
+        </w:tc>
+      </w:tr>
+    </w:tbl>
+    <w:p>
+      <w:pPr>
+        <w:pStyle w:val="Heading2"/>
+      </w:pPr>
+      <w:r>
+        <w:rPr>
+          <w:b/>
+          <w:color w:val="B45309"/>
+          <w:sz w:val="25"/>
+        </w:rPr>
+        <w:t>F) Frontend — Bileşenler (components/)</w:t>
+      </w:r>
+    </w:p>
+    <w:tbl>
+      <w:tblPr>
+        <w:tblStyle w:val="TableGrid"/>
+        <w:tblW w:type="auto" w:w="0"/>
+        <w:jc w:val="center"/>
+        <w:tblLook w:firstColumn="1" w:firstRow="1" w:lastColumn="0" w:lastRow="0" w:noHBand="0" w:noVBand="1" w:val="04A0"/>
+      </w:tblPr>
+      <w:tblGrid>
+        <w:gridCol w:w="3264"/>
+        <w:gridCol w:w="3264"/>
+        <w:gridCol w:w="3264"/>
+      </w:tblGrid>
+      <w:tr>
+        <w:tc>
+          <w:tcPr>
+            <w:tcW w:type="dxa" w:w="6336"/>
+            <w:shd w:val="clear" w:fill="B45309"/>
+          </w:tcPr>
+          <w:p>
+            <w:r>
+              <w:rPr>
+                <w:b/>
+                <w:color w:val="FFFFFF"/>
+                <w:sz w:val="18"/>
+              </w:rPr>
+              <w:t>Dosya</w:t>
+            </w:r>
+          </w:p>
+        </w:tc>
+        <w:tc>
+          <w:tcPr>
+            <w:tcW w:type="dxa" w:w="1152"/>
+            <w:shd w:val="clear" w:fill="B45309"/>
+          </w:tcPr>
+          <w:p>
+            <w:r>
+              <w:rPr>
+                <w:b/>
+                <w:color w:val="FFFFFF"/>
+                <w:sz w:val="18"/>
+              </w:rPr>
+              <w:t>Gün</w:t>
+            </w:r>
+          </w:p>
+        </w:tc>
+        <w:tc>
+          <w:tcPr>
+            <w:tcW w:type="dxa" w:w="1296"/>
+            <w:shd w:val="clear" w:fill="B45309"/>
+          </w:tcPr>
+          <w:p>
+            <w:r>
+              <w:rPr>
+                <w:b/>
+                <w:color w:val="FFFFFF"/>
+                <w:sz w:val="18"/>
+              </w:rPr>
+              <w:t>Sprint</w:t>
+            </w:r>
+          </w:p>
+        </w:tc>
+      </w:tr>
+      <w:tr>
+        <w:tc>
+          <w:tcPr>
+            <w:tcW w:type="dxa" w:w="6336"/>
+          </w:tcPr>
+          <w:p>
+            <w:pPr>
+              <w:spacing w:after="20"/>
+            </w:pPr>
+            <w:r>
+              <w:rPr>
+                <w:sz w:val="18"/>
+              </w:rPr>
+              <w:t>Layout.tsx, UserApprovalModal.tsx</w:t>
+            </w:r>
+          </w:p>
+        </w:tc>
+        <w:tc>
+          <w:tcPr>
+            <w:tcW w:type="dxa" w:w="1152"/>
+          </w:tcPr>
+          <w:p>
+            <w:pPr>
+              <w:spacing w:after="20"/>
+            </w:pPr>
+            <w:r>
+              <w:rPr>
+                <w:sz w:val="18"/>
+              </w:rPr>
+              <w:t>7</w:t>
+            </w:r>
+          </w:p>
+        </w:tc>
+        <w:tc>
+          <w:tcPr>
+            <w:tcW w:type="dxa" w:w="1296"/>
+          </w:tcPr>
+          <w:p>
+            <w:pPr>
+              <w:spacing w:after="20"/>
+            </w:pPr>
+            <w:r>
+              <w:rPr>
+                <w:sz w:val="18"/>
+              </w:rPr>
+              <w:t>S3</w:t>
+            </w:r>
+          </w:p>
+        </w:tc>
+      </w:tr>
+      <w:tr>
+        <w:tc>
+          <w:tcPr>
+            <w:tcW w:type="dxa" w:w="6336"/>
+            <w:shd w:val="clear" w:fill="F3F4F6"/>
+          </w:tcPr>
+          <w:p>
+            <w:pPr>
+              <w:spacing w:after="20"/>
+            </w:pPr>
+            <w:r>
+              <w:rPr>
+                <w:sz w:val="18"/>
+              </w:rPr>
+              <w:t>BodyMap.tsx</w:t>
+            </w:r>
+          </w:p>
+        </w:tc>
+        <w:tc>
+          <w:tcPr>
+            <w:tcW w:type="dxa" w:w="1152"/>
+            <w:shd w:val="clear" w:fill="F3F4F6"/>
+          </w:tcPr>
+          <w:p>
+            <w:pPr>
+              <w:spacing w:after="20"/>
+            </w:pPr>
+            <w:r>
+              <w:rPr>
+                <w:sz w:val="18"/>
+              </w:rPr>
+              <w:t>9</w:t>
+            </w:r>
+          </w:p>
+        </w:tc>
+        <w:tc>
+          <w:tcPr>
+            <w:tcW w:type="dxa" w:w="1296"/>
+            <w:shd w:val="clear" w:fill="F3F4F6"/>
+          </w:tcPr>
+          <w:p>
+            <w:pPr>
+              <w:spacing w:after="20"/>
+            </w:pPr>
+            <w:r>
+              <w:rPr>
+                <w:sz w:val="18"/>
+              </w:rPr>
+              <w:t>S4</w:t>
+            </w:r>
+          </w:p>
+        </w:tc>
+      </w:tr>
+      <w:tr>
+        <w:tc>
+          <w:tcPr>
+            <w:tcW w:type="dxa" w:w="6336"/>
+          </w:tcPr>
+          <w:p>
+            <w:pPr>
+              <w:spacing w:after="20"/>
+            </w:pPr>
+            <w:r>
+              <w:rPr>
+                <w:sz w:val="18"/>
+              </w:rPr>
+              <w:t>RiskMatrix.tsx (riskLevel yardımcısı)</w:t>
+            </w:r>
+          </w:p>
+        </w:tc>
+        <w:tc>
+          <w:tcPr>
+            <w:tcW w:type="dxa" w:w="1152"/>
+          </w:tcPr>
+          <w:p>
+            <w:pPr>
+              <w:spacing w:after="20"/>
+            </w:pPr>
+            <w:r>
+              <w:rPr>
+                <w:sz w:val="18"/>
+              </w:rPr>
+              <w:t>11</w:t>
+            </w:r>
+          </w:p>
+        </w:tc>
+        <w:tc>
+          <w:tcPr>
+            <w:tcW w:type="dxa" w:w="1296"/>
+          </w:tcPr>
+          <w:p>
+            <w:pPr>
+              <w:spacing w:after="20"/>
+            </w:pPr>
+            <w:r>
+              <w:rPr>
+                <w:sz w:val="18"/>
+              </w:rPr>
+              <w:t>S5</w:t>
+            </w:r>
+          </w:p>
+        </w:tc>
+      </w:tr>
+      <w:tr>
+        <w:tc>
+          <w:tcPr>
+            <w:tcW w:type="dxa" w:w="6336"/>
+            <w:shd w:val="clear" w:fill="F3F4F6"/>
+          </w:tcPr>
+          <w:p>
+            <w:pPr>
+              <w:spacing w:after="20"/>
+            </w:pPr>
+            <w:r>
+              <w:rPr>
+                <w:sz w:val="18"/>
+              </w:rPr>
+              <w:t>NotificationBell.tsx</w:t>
+            </w:r>
+          </w:p>
+        </w:tc>
+        <w:tc>
+          <w:tcPr>
+            <w:tcW w:type="dxa" w:w="1152"/>
+            <w:shd w:val="clear" w:fill="F3F4F6"/>
+          </w:tcPr>
+          <w:p>
+            <w:pPr>
+              <w:spacing w:after="20"/>
+            </w:pPr>
+            <w:r>
+              <w:rPr>
+                <w:sz w:val="18"/>
+              </w:rPr>
+              <w:t>13</w:t>
+            </w:r>
+          </w:p>
+        </w:tc>
+        <w:tc>
+          <w:tcPr>
+            <w:tcW w:type="dxa" w:w="1296"/>
+            <w:shd w:val="clear" w:fill="F3F4F6"/>
+          </w:tcPr>
+          <w:p>
+            <w:pPr>
+              <w:spacing w:after="20"/>
+            </w:pPr>
+            <w:r>
+              <w:rPr>
+                <w:sz w:val="18"/>
+              </w:rPr>
+              <w:t>S6</w:t>
+            </w:r>
+          </w:p>
+        </w:tc>
+      </w:tr>
+      <w:tr>
+        <w:tc>
+          <w:tcPr>
+            <w:tcW w:type="dxa" w:w="6336"/>
+          </w:tcPr>
+          <w:p>
+            <w:pPr>
+              <w:spacing w:after="20"/>
+            </w:pPr>
+            <w:r>
+              <w:rPr>
+                <w:sz w:val="18"/>
+              </w:rPr>
+              <w:t>PhotoUpload.tsx, AuthenticatedMedia.tsx</w:t>
+            </w:r>
+          </w:p>
+        </w:tc>
+        <w:tc>
+          <w:tcPr>
+            <w:tcW w:type="dxa" w:w="1152"/>
+          </w:tcPr>
+          <w:p>
+            <w:pPr>
+              <w:spacing w:after="20"/>
+            </w:pPr>
+            <w:r>
+              <w:rPr>
+                <w:sz w:val="18"/>
+              </w:rPr>
+              <w:t>15</w:t>
+            </w:r>
+          </w:p>
+        </w:tc>
+        <w:tc>
+          <w:tcPr>
+            <w:tcW w:type="dxa" w:w="1296"/>
+          </w:tcPr>
+          <w:p>
+            <w:pPr>
+              <w:spacing w:after="20"/>
+            </w:pPr>
+            <w:r>
+              <w:rPr>
+                <w:sz w:val="18"/>
+              </w:rPr>
+              <w:t>S7</w:t>
+            </w:r>
+          </w:p>
+        </w:tc>
+      </w:tr>
+      <w:tr>
+        <w:tc>
+          <w:tcPr>
+            <w:tcW w:type="dxa" w:w="6336"/>
+            <w:shd w:val="clear" w:fill="F3F4F6"/>
+          </w:tcPr>
+          <w:p>
+            <w:pPr>
+              <w:spacing w:after="20"/>
+            </w:pPr>
+            <w:r>
+              <w:rPr>
+                <w:sz w:val="18"/>
+              </w:rPr>
+              <w:t>PrintableReport.tsx</w:t>
+            </w:r>
+          </w:p>
+        </w:tc>
+        <w:tc>
+          <w:tcPr>
+            <w:tcW w:type="dxa" w:w="1152"/>
+            <w:shd w:val="clear" w:fill="F3F4F6"/>
+          </w:tcPr>
+          <w:p>
+            <w:pPr>
+              <w:spacing w:after="20"/>
+            </w:pPr>
+            <w:r>
+              <w:rPr>
+                <w:sz w:val="18"/>
+              </w:rPr>
+              <w:t>17</w:t>
+            </w:r>
+          </w:p>
+        </w:tc>
+        <w:tc>
+          <w:tcPr>
+            <w:tcW w:type="dxa" w:w="1296"/>
+            <w:shd w:val="clear" w:fill="F3F4F6"/>
+          </w:tcPr>
+          <w:p>
+            <w:pPr>
+              <w:spacing w:after="20"/>
+            </w:pPr>
+            <w:r>
+              <w:rPr>
+                <w:sz w:val="18"/>
+              </w:rPr>
+              <w:t>S8</w:t>
+            </w:r>
+          </w:p>
+        </w:tc>
+      </w:tr>
+    </w:tbl>
+    <w:p>
+      <w:pPr>
+        <w:pStyle w:val="Heading2"/>
+      </w:pPr>
+      <w:r>
+        <w:rPr>
+          <w:b/>
+          <w:color w:val="B45309"/>
+          <w:sz w:val="25"/>
+        </w:rPr>
+        <w:t>G) Frontend — Diğer (klasör dışı)</w:t>
+      </w:r>
+    </w:p>
+    <w:tbl>
+      <w:tblPr>
+        <w:tblStyle w:val="TableGrid"/>
+        <w:tblW w:type="auto" w:w="0"/>
+        <w:jc w:val="center"/>
+        <w:tblLook w:firstColumn="1" w:firstRow="1" w:lastColumn="0" w:lastRow="0" w:noHBand="0" w:noVBand="1" w:val="04A0"/>
+      </w:tblPr>
+      <w:tblGrid>
+        <w:gridCol w:w="3264"/>
+        <w:gridCol w:w="3264"/>
+        <w:gridCol w:w="3264"/>
+      </w:tblGrid>
+      <w:tr>
+        <w:tc>
+          <w:tcPr>
+            <w:tcW w:type="dxa" w:w="6336"/>
+            <w:shd w:val="clear" w:fill="B45309"/>
+          </w:tcPr>
+          <w:p>
+            <w:r>
+              <w:rPr>
+                <w:b/>
+                <w:color w:val="FFFFFF"/>
+                <w:sz w:val="18"/>
+              </w:rPr>
+              <w:t>Dosya</w:t>
+            </w:r>
+          </w:p>
+        </w:tc>
+        <w:tc>
+          <w:tcPr>
+            <w:tcW w:type="dxa" w:w="1296"/>
+            <w:shd w:val="clear" w:fill="B45309"/>
+          </w:tcPr>
+          <w:p>
+            <w:r>
+              <w:rPr>
+                <w:b/>
+                <w:color w:val="FFFFFF"/>
+                <w:sz w:val="18"/>
+              </w:rPr>
+              <w:t>Gün</w:t>
+            </w:r>
+          </w:p>
+        </w:tc>
+        <w:tc>
+          <w:tcPr>
+            <w:tcW w:type="dxa" w:w="1152"/>
+            <w:shd w:val="clear" w:fill="B45309"/>
+          </w:tcPr>
+          <w:p>
+            <w:r>
+              <w:rPr>
+                <w:b/>
+                <w:color w:val="FFFFFF"/>
+                <w:sz w:val="18"/>
+              </w:rPr>
+              <w:t>Sprint</w:t>
+            </w:r>
+          </w:p>
+        </w:tc>
+      </w:tr>
+      <w:tr>
+        <w:tc>
+          <w:tcPr>
+            <w:tcW w:type="dxa" w:w="6336"/>
+          </w:tcPr>
+          <w:p>
+            <w:pPr>
+              <w:spacing w:after="20"/>
+            </w:pPr>
+            <w:r>
+              <w:rPr>
+                <w:sz w:val="18"/>
+              </w:rPr>
+              <w:t>main.tsx, App.tsx, styles.css</w:t>
+            </w:r>
+          </w:p>
+        </w:tc>
+        <w:tc>
+          <w:tcPr>
+            <w:tcW w:type="dxa" w:w="1296"/>
+          </w:tcPr>
+          <w:p>
+            <w:pPr>
+              <w:spacing w:after="20"/>
+            </w:pPr>
+            <w:r>
+              <w:rPr>
+                <w:sz w:val="18"/>
+              </w:rPr>
+              <w:t>2 (App.tsx rota ekledikçe büyür)</w:t>
+            </w:r>
+          </w:p>
+        </w:tc>
+        <w:tc>
+          <w:tcPr>
+            <w:tcW w:type="dxa" w:w="1152"/>
+          </w:tcPr>
+          <w:p>
+            <w:pPr>
+              <w:spacing w:after="20"/>
+            </w:pPr>
+            <w:r>
+              <w:rPr>
+                <w:sz w:val="18"/>
+              </w:rPr>
+              <w:t>S1</w:t>
+            </w:r>
+          </w:p>
+        </w:tc>
+      </w:tr>
+      <w:tr>
+        <w:tc>
+          <w:tcPr>
+            <w:tcW w:type="dxa" w:w="6336"/>
+            <w:shd w:val="clear" w:fill="F3F4F6"/>
+          </w:tcPr>
+          <w:p>
+            <w:pPr>
+              <w:spacing w:after="20"/>
+            </w:pPr>
+            <w:r>
+              <w:rPr>
+                <w:sz w:val="18"/>
+              </w:rPr>
+              <w:t>api/client.ts, auth/AuthContext.tsx</w:t>
+            </w:r>
+          </w:p>
+        </w:tc>
+        <w:tc>
+          <w:tcPr>
+            <w:tcW w:type="dxa" w:w="1296"/>
+            <w:shd w:val="clear" w:fill="F3F4F6"/>
+          </w:tcPr>
+          <w:p>
+            <w:pPr>
+              <w:spacing w:after="20"/>
+            </w:pPr>
+            <w:r>
+              <w:rPr>
+                <w:sz w:val="18"/>
+              </w:rPr>
+              <w:t>4</w:t>
+            </w:r>
+          </w:p>
+        </w:tc>
+        <w:tc>
+          <w:tcPr>
+            <w:tcW w:type="dxa" w:w="1152"/>
+            <w:shd w:val="clear" w:fill="F3F4F6"/>
+          </w:tcPr>
+          <w:p>
+            <w:pPr>
+              <w:spacing w:after="20"/>
+            </w:pPr>
+            <w:r>
+              <w:rPr>
+                <w:sz w:val="18"/>
+              </w:rPr>
+              <w:t>S2</w:t>
+            </w:r>
+          </w:p>
+        </w:tc>
+      </w:tr>
+      <w:tr>
+        <w:tc>
+          <w:tcPr>
+            <w:tcW w:type="dxa" w:w="6336"/>
+          </w:tcPr>
+          <w:p>
+            <w:pPr>
+              <w:spacing w:after="20"/>
+            </w:pPr>
+            <w:r>
+              <w:rPr>
+                <w:sz w:val="18"/>
+              </w:rPr>
+              <w:t>types.ts</w:t>
+            </w:r>
+          </w:p>
+        </w:tc>
+        <w:tc>
+          <w:tcPr>
+            <w:tcW w:type="dxa" w:w="1296"/>
+          </w:tcPr>
+          <w:p>
+            <w:pPr>
+              <w:spacing w:after="20"/>
+            </w:pPr>
+            <w:r>
+              <w:rPr>
+                <w:sz w:val="18"/>
+              </w:rPr>
+              <w:t>2 temel → parça parça (ör. hasPermission = 7)</w:t>
+            </w:r>
+          </w:p>
+        </w:tc>
+        <w:tc>
+          <w:tcPr>
+            <w:tcW w:type="dxa" w:w="1152"/>
+          </w:tcPr>
+          <w:p>
+            <w:pPr>
+              <w:spacing w:after="20"/>
+            </w:pPr>
+            <w:r>
+              <w:rPr>
+                <w:sz w:val="18"/>
+              </w:rPr>
+              <w:t>S1→S3</w:t>
+            </w:r>
+          </w:p>
+        </w:tc>
+      </w:tr>
+      <w:tr>
+        <w:tc>
+          <w:tcPr>
+            <w:tcW w:type="dxa" w:w="6336"/>
+            <w:shd w:val="clear" w:fill="F3F4F6"/>
+          </w:tcPr>
+          <w:p>
+            <w:pPr>
+              <w:spacing w:after="20"/>
+            </w:pPr>
+            <w:r>
+              <w:rPr>
+                <w:sz w:val="18"/>
+              </w:rPr>
+              <w:t>utils/sound.ts</w:t>
+            </w:r>
+          </w:p>
+        </w:tc>
+        <w:tc>
+          <w:tcPr>
+            <w:tcW w:type="dxa" w:w="1296"/>
+            <w:shd w:val="clear" w:fill="F3F4F6"/>
+          </w:tcPr>
+          <w:p>
+            <w:pPr>
+              <w:spacing w:after="20"/>
+            </w:pPr>
+            <w:r>
+              <w:rPr>
+                <w:sz w:val="18"/>
+              </w:rPr>
+              <w:t>13</w:t>
+            </w:r>
+          </w:p>
+        </w:tc>
+        <w:tc>
+          <w:tcPr>
+            <w:tcW w:type="dxa" w:w="1152"/>
+            <w:shd w:val="clear" w:fill="F3F4F6"/>
+          </w:tcPr>
+          <w:p>
+            <w:pPr>
+              <w:spacing w:after="20"/>
+            </w:pPr>
+            <w:r>
+              <w:rPr>
+                <w:sz w:val="18"/>
+              </w:rPr>
+              <w:t>S6</w:t>
+            </w:r>
+          </w:p>
+        </w:tc>
+      </w:tr>
+      <w:tr>
+        <w:tc>
+          <w:tcPr>
+            <w:tcW w:type="dxa" w:w="6336"/>
+          </w:tcPr>
+          <w:p>
+            <w:pPr>
+              <w:spacing w:after="20"/>
+            </w:pPr>
+            <w:r>
+              <w:rPr>
+                <w:sz w:val="18"/>
+              </w:rPr>
+              <w:t>i18n/ (index, tr, en), html2pdf.d.ts</w:t>
+            </w:r>
+          </w:p>
+        </w:tc>
+        <w:tc>
+          <w:tcPr>
+            <w:tcW w:type="dxa" w:w="1296"/>
+          </w:tcPr>
+          <w:p>
+            <w:pPr>
+              <w:spacing w:after="20"/>
+            </w:pPr>
+            <w:r>
+              <w:rPr>
+                <w:sz w:val="18"/>
+              </w:rPr>
+              <w:t>17</w:t>
+            </w:r>
+          </w:p>
+        </w:tc>
+        <w:tc>
+          <w:tcPr>
+            <w:tcW w:type="dxa" w:w="1152"/>
+          </w:tcPr>
+          <w:p>
+            <w:pPr>
+              <w:spacing w:after="20"/>
+            </w:pPr>
+            <w:r>
+              <w:rPr>
+                <w:sz w:val="18"/>
+              </w:rPr>
+              <w:t>S8</w:t>
+            </w:r>
+          </w:p>
+        </w:tc>
+      </w:tr>
+    </w:tbl>
+    <w:p>
+      <w:pPr>
+        <w:spacing w:after="120"/>
+      </w:pPr>
+      <w:r>
+        <w:rPr>
+          <w:b w:val="0"/>
+          <w:i/>
+          <w:color w:val="555F6D"/>
+          <w:sz w:val="18"/>
+        </w:rPr>
+        <w:t>Not: 'Büyür' etiketli dosyalar tek günde bitmez; ilgili modül geldikçe üzerine ekleme yapılır (artımlı geliştirme). Örneğin schema.prisma her yeni model eklendiğinde, reports.service.ts kaza→ramak kala→iş akışı adımlarında genişler.</w:t>
       </w:r>
     </w:p>
     <w:sectPr>

</xml_diff>